<commit_message>
docs & exp: update all dims (10, 30, 50) and populate full results into Word reports
</commit_message>
<xml_diff>
--- a/docs/Bao_Cao_Tuan_4_Cuong.docx
+++ b/docs/Bao_Cao_Tuan_4_Cuong.docx
@@ -2481,15 +2481,8 @@
             <w:vAlign w:val="center"/>
           </w:tcPr>
           <w:p>
-            <w:pPr>
-              <w:spacing w:line="276" w:lineRule="auto"/>
-            </w:pPr>
-            <w:r>
-              <w:rPr>
-                <w:rFonts w:eastAsia="Times New Roman"/>
-                <w:sz w:val="22"/>
-              </w:rPr>
-              <w:t>2, 10, 30</w:t>
+            <w:r>
+              <w:t>10, 30, 50</w:t>
             </w:r>
           </w:p>
         </w:tc>
@@ -2563,15 +2556,8 @@
             <w:vAlign w:val="center"/>
           </w:tcPr>
           <w:p>
-            <w:pPr>
-              <w:spacing w:line="276" w:lineRule="auto"/>
-            </w:pPr>
-            <w:r>
-              <w:rPr>
-                <w:rFonts w:eastAsia="Times New Roman"/>
-                <w:sz w:val="22"/>
-              </w:rPr>
-              <w:t>6 × 3 × 30 = 540</w:t>
+            <w:r>
+              <w:t>6 × 3 × 30 = 540 (dims: 10, 30, 50)</w:t>
             </w:r>
           </w:p>
         </w:tc>
@@ -2620,7 +2606,7 @@
     </w:tbl>
     <w:p>
       <w:r>
-        <w:t>Mỗi lần chạy khởi tạo quần thể bằng bộ sinh số ngẫu nhiên NumPy theo seed tương ứng. File dbo_benchmark_runs.csv ghi chi tiết 540 lần chạy; dbo_benchmark_summary.csv tổng hợp best, mean, std và worst cho 18 cấu hình.</w:t>
+        <w:t>Mỗi lần chạy khởi tạo quần thể bằng bộ sinh số ngẫu nhiên NumPy theo seed tương ứng. File dbo_benchmark_runs.csv ghi chi tiết 540 lần chạy; dbo_benchmark_summary.csv tổng hợp best, mean, std và worst cho 18 cấu hình (dims: 10, 30, 50).</w:t>
       </w:r>
     </w:p>
     <w:p>
@@ -2636,7 +2622,7 @@
     </w:p>
     <w:p>
       <w:r>
-        <w:t>Thí nghiệm chính thức hoàn thành 540/540 lượt chạy. Bảng 5.1 trình bày đầy đủ 18 cấu hình (6 hàm × 3 số chiều), mỗi cấu hình gồm 30 lần chạy độc lập.</w:t>
+        <w:t>Thí nghiệm chính thức hoàn thành đầy đủ 540/540 lượt chạy. Bảng 5.1 trình bày chi tiết 18 cấu hình (6 hàm × 3 số chiều: 10, 30, 50), mỗi cấu hình gồm 30 lần chạy độc lập (M = 30).</w:t>
       </w:r>
     </w:p>
     <w:p>
@@ -2819,22 +2805,18 @@
         </w:tc>
       </w:tr>
       <w:tr>
-        <w:trPr>
-          <w:jc w:val="center"/>
-        </w:trPr>
-        <w:tc>
-          <w:tcPr>
-            <w:tcW w:w="1215" w:type="dxa"/>
-            <w:vAlign w:val="center"/>
-          </w:tcPr>
-          <w:p>
-            <w:pPr>
-              <w:spacing w:line="276" w:lineRule="auto"/>
-            </w:pPr>
-            <w:r>
-              <w:rPr>
-                <w:rFonts w:eastAsia="Times New Roman"/>
-                <w:sz w:val="16"/>
+        <w:tc>
+          <w:tcPr>
+            <w:tcW w:type="dxa" w:w="1214"/>
+          </w:tcPr>
+          <w:p>
+            <w:pPr>
+              <w:spacing w:before="40" w:after="40"/>
+            </w:pPr>
+            <w:r>
+              <w:rPr>
+                <w:rFonts w:ascii="Times New Roman" w:hAnsi="Times New Roman"/>
+                <w:sz w:val="19"/>
               </w:rPr>
               <w:t>sphere</w:t>
             </w:r>
@@ -2842,37 +2824,33 @@
         </w:tc>
         <w:tc>
           <w:tcPr>
-            <w:tcW w:w="1215" w:type="dxa"/>
-            <w:vAlign w:val="center"/>
-          </w:tcPr>
-          <w:p>
-            <w:pPr>
-              <w:spacing w:line="276" w:lineRule="auto"/>
-              <w:jc w:val="center"/>
-            </w:pPr>
-            <w:r>
-              <w:rPr>
-                <w:rFonts w:eastAsia="Times New Roman"/>
-                <w:sz w:val="16"/>
-              </w:rPr>
-              <w:t>2</w:t>
-            </w:r>
-          </w:p>
-        </w:tc>
-        <w:tc>
-          <w:tcPr>
-            <w:tcW w:w="1215" w:type="dxa"/>
-            <w:vAlign w:val="center"/>
-          </w:tcPr>
-          <w:p>
-            <w:pPr>
-              <w:spacing w:line="276" w:lineRule="auto"/>
-              <w:jc w:val="center"/>
-            </w:pPr>
-            <w:r>
-              <w:rPr>
-                <w:rFonts w:eastAsia="Times New Roman"/>
-                <w:sz w:val="16"/>
+            <w:tcW w:type="dxa" w:w="1212"/>
+          </w:tcPr>
+          <w:p>
+            <w:pPr>
+              <w:spacing w:before="40" w:after="40"/>
+            </w:pPr>
+            <w:r>
+              <w:rPr>
+                <w:rFonts w:ascii="Times New Roman" w:hAnsi="Times New Roman"/>
+                <w:sz w:val="19"/>
+              </w:rPr>
+              <w:t>10</w:t>
+            </w:r>
+          </w:p>
+        </w:tc>
+        <w:tc>
+          <w:tcPr>
+            <w:tcW w:type="dxa" w:w="1212"/>
+          </w:tcPr>
+          <w:p>
+            <w:pPr>
+              <w:spacing w:before="40" w:after="40"/>
+            </w:pPr>
+            <w:r>
+              <w:rPr>
+                <w:rFonts w:ascii="Times New Roman" w:hAnsi="Times New Roman"/>
+                <w:sz w:val="19"/>
               </w:rPr>
               <w:t>30</w:t>
             </w:r>
@@ -2880,98 +2858,86 @@
         </w:tc>
         <w:tc>
           <w:tcPr>
-            <w:tcW w:w="1215" w:type="dxa"/>
-            <w:vAlign w:val="center"/>
-          </w:tcPr>
-          <w:p>
-            <w:pPr>
-              <w:spacing w:line="276" w:lineRule="auto"/>
-              <w:jc w:val="center"/>
-            </w:pPr>
-            <w:r>
-              <w:rPr>
-                <w:rFonts w:eastAsia="Times New Roman"/>
-                <w:sz w:val="16"/>
-              </w:rPr>
-              <w:t>2.1539e-190</w:t>
-            </w:r>
-          </w:p>
-        </w:tc>
-        <w:tc>
-          <w:tcPr>
-            <w:tcW w:w="1215" w:type="dxa"/>
-            <w:vAlign w:val="center"/>
-          </w:tcPr>
-          <w:p>
-            <w:pPr>
-              <w:spacing w:line="276" w:lineRule="auto"/>
-              <w:jc w:val="center"/>
-            </w:pPr>
-            <w:r>
-              <w:rPr>
-                <w:rFonts w:eastAsia="Times New Roman"/>
-                <w:sz w:val="16"/>
-              </w:rPr>
-              <w:t>2.5812e-166</w:t>
-            </w:r>
-          </w:p>
-        </w:tc>
-        <w:tc>
-          <w:tcPr>
-            <w:tcW w:w="1215" w:type="dxa"/>
-            <w:vAlign w:val="center"/>
-          </w:tcPr>
-          <w:p>
-            <w:pPr>
-              <w:spacing w:line="276" w:lineRule="auto"/>
-              <w:jc w:val="center"/>
-            </w:pPr>
-            <w:r>
-              <w:rPr>
-                <w:rFonts w:eastAsia="Times New Roman"/>
-                <w:sz w:val="16"/>
-              </w:rPr>
-              <w:t>0.0000e+00</w:t>
-            </w:r>
-          </w:p>
-        </w:tc>
-        <w:tc>
-          <w:tcPr>
-            <w:tcW w:w="1215" w:type="dxa"/>
-            <w:vAlign w:val="center"/>
-          </w:tcPr>
-          <w:p>
-            <w:pPr>
-              <w:spacing w:line="276" w:lineRule="auto"/>
-              <w:jc w:val="center"/>
-            </w:pPr>
-            <w:r>
-              <w:rPr>
-                <w:rFonts w:eastAsia="Times New Roman"/>
-                <w:sz w:val="16"/>
-              </w:rPr>
-              <w:t>5.4202e-165</w:t>
+            <w:tcW w:type="dxa" w:w="1214"/>
+          </w:tcPr>
+          <w:p>
+            <w:pPr>
+              <w:spacing w:before="40" w:after="40"/>
+            </w:pPr>
+            <w:r>
+              <w:rPr>
+                <w:rFonts w:ascii="Times New Roman" w:hAnsi="Times New Roman"/>
+                <w:sz w:val="19"/>
+              </w:rPr>
+              <w:t>1.4553e-201</w:t>
+            </w:r>
+          </w:p>
+        </w:tc>
+        <w:tc>
+          <w:tcPr>
+            <w:tcW w:type="dxa" w:w="1214"/>
+          </w:tcPr>
+          <w:p>
+            <w:pPr>
+              <w:spacing w:before="40" w:after="40"/>
+            </w:pPr>
+            <w:r>
+              <w:rPr>
+                <w:rFonts w:ascii="Times New Roman" w:hAnsi="Times New Roman"/>
+                <w:sz w:val="19"/>
+              </w:rPr>
+              <w:t>3.4933e-153</w:t>
+            </w:r>
+          </w:p>
+        </w:tc>
+        <w:tc>
+          <w:tcPr>
+            <w:tcW w:type="dxa" w:w="1214"/>
+          </w:tcPr>
+          <w:p>
+            <w:pPr>
+              <w:spacing w:before="40" w:after="40"/>
+            </w:pPr>
+            <w:r>
+              <w:rPr>
+                <w:rFonts w:ascii="Times New Roman" w:hAnsi="Times New Roman"/>
+                <w:sz w:val="19"/>
+              </w:rPr>
+              <w:t>1.8812e-152</w:t>
+            </w:r>
+          </w:p>
+        </w:tc>
+        <w:tc>
+          <w:tcPr>
+            <w:tcW w:type="dxa" w:w="1214"/>
+          </w:tcPr>
+          <w:p>
+            <w:pPr>
+              <w:spacing w:before="40" w:after="40"/>
+            </w:pPr>
+            <w:r>
+              <w:rPr>
+                <w:rFonts w:ascii="Times New Roman" w:hAnsi="Times New Roman"/>
+                <w:sz w:val="19"/>
+              </w:rPr>
+              <w:t>1.0480e-151</w:t>
             </w:r>
           </w:p>
         </w:tc>
       </w:tr>
       <w:tr>
-        <w:trPr>
-          <w:jc w:val="center"/>
-        </w:trPr>
-        <w:tc>
-          <w:tcPr>
-            <w:tcW w:w="1215" w:type="dxa"/>
-            <w:vAlign w:val="center"/>
-          </w:tcPr>
-          <w:p>
-            <w:pPr>
-              <w:spacing w:line="276" w:lineRule="auto"/>
-            </w:pPr>
-            <w:r>
-              <w:rPr>
-                <w:rFonts w:eastAsia="Times New Roman"/>
-                <w:sz w:val="16"/>
+        <w:tc>
+          <w:tcPr>
+            <w:tcW w:type="dxa" w:w="1214"/>
+          </w:tcPr>
+          <w:p>
+            <w:pPr>
+              <w:spacing w:before="40" w:after="40"/>
+            </w:pPr>
+            <w:r>
+              <w:rPr>
+                <w:rFonts w:ascii="Times New Roman" w:hAnsi="Times New Roman"/>
+                <w:sz w:val="19"/>
               </w:rPr>
               <w:t>sphere</w:t>
             </w:r>
@@ -2979,37 +2945,16 @@
         </w:tc>
         <w:tc>
           <w:tcPr>
-            <w:tcW w:w="1215" w:type="dxa"/>
-            <w:vAlign w:val="center"/>
-          </w:tcPr>
-          <w:p>
-            <w:pPr>
-              <w:spacing w:line="276" w:lineRule="auto"/>
-              <w:jc w:val="center"/>
-            </w:pPr>
-            <w:r>
-              <w:rPr>
-                <w:rFonts w:eastAsia="Times New Roman"/>
-                <w:sz w:val="16"/>
-              </w:rPr>
-              <w:t>10</w:t>
-            </w:r>
-          </w:p>
-        </w:tc>
-        <w:tc>
-          <w:tcPr>
-            <w:tcW w:w="1215" w:type="dxa"/>
-            <w:vAlign w:val="center"/>
-          </w:tcPr>
-          <w:p>
-            <w:pPr>
-              <w:spacing w:line="276" w:lineRule="auto"/>
-              <w:jc w:val="center"/>
-            </w:pPr>
-            <w:r>
-              <w:rPr>
-                <w:rFonts w:eastAsia="Times New Roman"/>
-                <w:sz w:val="16"/>
+            <w:tcW w:type="dxa" w:w="1212"/>
+          </w:tcPr>
+          <w:p>
+            <w:pPr>
+              <w:spacing w:before="40" w:after="40"/>
+            </w:pPr>
+            <w:r>
+              <w:rPr>
+                <w:rFonts w:ascii="Times New Roman" w:hAnsi="Times New Roman"/>
+                <w:sz w:val="19"/>
               </w:rPr>
               <w:t>30</w:t>
             </w:r>
@@ -3017,98 +2962,103 @@
         </w:tc>
         <w:tc>
           <w:tcPr>
-            <w:tcW w:w="1215" w:type="dxa"/>
-            <w:vAlign w:val="center"/>
-          </w:tcPr>
-          <w:p>
-            <w:pPr>
-              <w:spacing w:line="276" w:lineRule="auto"/>
-              <w:jc w:val="center"/>
-            </w:pPr>
-            <w:r>
-              <w:rPr>
-                <w:rFonts w:eastAsia="Times New Roman"/>
-                <w:sz w:val="16"/>
-              </w:rPr>
-              <w:t>1.3844e-199</w:t>
-            </w:r>
-          </w:p>
-        </w:tc>
-        <w:tc>
-          <w:tcPr>
-            <w:tcW w:w="1215" w:type="dxa"/>
-            <w:vAlign w:val="center"/>
-          </w:tcPr>
-          <w:p>
-            <w:pPr>
-              <w:spacing w:line="276" w:lineRule="auto"/>
-              <w:jc w:val="center"/>
-            </w:pPr>
-            <w:r>
-              <w:rPr>
-                <w:rFonts w:eastAsia="Times New Roman"/>
-                <w:sz w:val="16"/>
-              </w:rPr>
-              <w:t>1.4858e-141</w:t>
-            </w:r>
-          </w:p>
-        </w:tc>
-        <w:tc>
-          <w:tcPr>
-            <w:tcW w:w="1215" w:type="dxa"/>
-            <w:vAlign w:val="center"/>
-          </w:tcPr>
-          <w:p>
-            <w:pPr>
-              <w:spacing w:line="276" w:lineRule="auto"/>
-              <w:jc w:val="center"/>
-            </w:pPr>
-            <w:r>
-              <w:rPr>
-                <w:rFonts w:eastAsia="Times New Roman"/>
-                <w:sz w:val="16"/>
-              </w:rPr>
-              <w:t>8.0015e-141</w:t>
-            </w:r>
-          </w:p>
-        </w:tc>
-        <w:tc>
-          <w:tcPr>
-            <w:tcW w:w="1215" w:type="dxa"/>
-            <w:vAlign w:val="center"/>
-          </w:tcPr>
-          <w:p>
-            <w:pPr>
-              <w:spacing w:line="276" w:lineRule="auto"/>
-              <w:jc w:val="center"/>
-            </w:pPr>
-            <w:r>
-              <w:rPr>
-                <w:rFonts w:eastAsia="Times New Roman"/>
-                <w:sz w:val="16"/>
-              </w:rPr>
-              <w:t>4.4575e-140</w:t>
+            <w:tcW w:type="dxa" w:w="1212"/>
+          </w:tcPr>
+          <w:p>
+            <w:pPr>
+              <w:spacing w:before="40" w:after="40"/>
+            </w:pPr>
+            <w:r>
+              <w:rPr>
+                <w:rFonts w:ascii="Times New Roman" w:hAnsi="Times New Roman"/>
+                <w:sz w:val="19"/>
+              </w:rPr>
+              <w:t>30</w:t>
+            </w:r>
+          </w:p>
+        </w:tc>
+        <w:tc>
+          <w:tcPr>
+            <w:tcW w:type="dxa" w:w="1214"/>
+          </w:tcPr>
+          <w:p>
+            <w:pPr>
+              <w:spacing w:before="40" w:after="40"/>
+            </w:pPr>
+            <w:r>
+              <w:rPr>
+                <w:rFonts w:ascii="Times New Roman" w:hAnsi="Times New Roman"/>
+                <w:sz w:val="19"/>
+              </w:rPr>
+              <w:t>8.2110e-214</w:t>
+            </w:r>
+          </w:p>
+        </w:tc>
+        <w:tc>
+          <w:tcPr>
+            <w:tcW w:type="dxa" w:w="1214"/>
+          </w:tcPr>
+          <w:p>
+            <w:pPr>
+              <w:spacing w:before="40" w:after="40"/>
+            </w:pPr>
+            <w:r>
+              <w:rPr>
+                <w:rFonts w:ascii="Times New Roman" w:hAnsi="Times New Roman"/>
+                <w:sz w:val="19"/>
+              </w:rPr>
+              <w:t>2.0602e-158</w:t>
+            </w:r>
+          </w:p>
+        </w:tc>
+        <w:tc>
+          <w:tcPr>
+            <w:tcW w:type="dxa" w:w="1214"/>
+          </w:tcPr>
+          <w:p>
+            <w:pPr>
+              <w:spacing w:before="40" w:after="40"/>
+            </w:pPr>
+            <w:r>
+              <w:rPr>
+                <w:rFonts w:ascii="Times New Roman" w:hAnsi="Times New Roman"/>
+                <w:sz w:val="19"/>
+              </w:rPr>
+              <w:t>1.1095e-157</w:t>
+            </w:r>
+          </w:p>
+        </w:tc>
+        <w:tc>
+          <w:tcPr>
+            <w:tcW w:type="dxa" w:w="1214"/>
+          </w:tcPr>
+          <w:p>
+            <w:pPr>
+              <w:spacing w:before="40" w:after="40"/>
+            </w:pPr>
+            <w:r>
+              <w:rPr>
+                <w:rFonts w:ascii="Times New Roman" w:hAnsi="Times New Roman"/>
+                <w:sz w:val="19"/>
+              </w:rPr>
+              <w:t>6.1807e-157</w:t>
             </w:r>
           </w:p>
         </w:tc>
       </w:tr>
       <w:tr>
-        <w:trPr>
-          <w:jc w:val="center"/>
-        </w:trPr>
-        <w:tc>
-          <w:tcPr>
-            <w:tcW w:w="1215" w:type="dxa"/>
-            <w:vAlign w:val="center"/>
-          </w:tcPr>
-          <w:p>
-            <w:pPr>
-              <w:spacing w:line="276" w:lineRule="auto"/>
-            </w:pPr>
-            <w:r>
-              <w:rPr>
-                <w:rFonts w:eastAsia="Times New Roman"/>
-                <w:sz w:val="16"/>
+        <w:tc>
+          <w:tcPr>
+            <w:tcW w:type="dxa" w:w="1214"/>
+          </w:tcPr>
+          <w:p>
+            <w:pPr>
+              <w:spacing w:before="40" w:after="40"/>
+            </w:pPr>
+            <w:r>
+              <w:rPr>
+                <w:rFonts w:ascii="Times New Roman" w:hAnsi="Times New Roman"/>
+                <w:sz w:val="19"/>
               </w:rPr>
               <w:t>sphere</w:t>
             </w:r>
@@ -3116,18 +3066,33 @@
         </w:tc>
         <w:tc>
           <w:tcPr>
-            <w:tcW w:w="1215" w:type="dxa"/>
-            <w:vAlign w:val="center"/>
-          </w:tcPr>
-          <w:p>
-            <w:pPr>
-              <w:spacing w:line="276" w:lineRule="auto"/>
-              <w:jc w:val="center"/>
-            </w:pPr>
-            <w:r>
-              <w:rPr>
-                <w:rFonts w:eastAsia="Times New Roman"/>
-                <w:sz w:val="16"/>
+            <w:tcW w:type="dxa" w:w="1212"/>
+          </w:tcPr>
+          <w:p>
+            <w:pPr>
+              <w:spacing w:before="40" w:after="40"/>
+            </w:pPr>
+            <w:r>
+              <w:rPr>
+                <w:rFonts w:ascii="Times New Roman" w:hAnsi="Times New Roman"/>
+                <w:sz w:val="19"/>
+              </w:rPr>
+              <w:t>50</w:t>
+            </w:r>
+          </w:p>
+        </w:tc>
+        <w:tc>
+          <w:tcPr>
+            <w:tcW w:type="dxa" w:w="1212"/>
+          </w:tcPr>
+          <w:p>
+            <w:pPr>
+              <w:spacing w:before="40" w:after="40"/>
+            </w:pPr>
+            <w:r>
+              <w:rPr>
+                <w:rFonts w:ascii="Times New Roman" w:hAnsi="Times New Roman"/>
+                <w:sz w:val="19"/>
               </w:rPr>
               <w:t>30</w:t>
             </w:r>
@@ -3135,75 +3100,50 @@
         </w:tc>
         <w:tc>
           <w:tcPr>
-            <w:tcW w:w="1215" w:type="dxa"/>
-            <w:vAlign w:val="center"/>
-          </w:tcPr>
-          <w:p>
-            <w:pPr>
-              <w:spacing w:line="276" w:lineRule="auto"/>
-              <w:jc w:val="center"/>
-            </w:pPr>
-            <w:r>
-              <w:rPr>
-                <w:rFonts w:eastAsia="Times New Roman"/>
-                <w:sz w:val="16"/>
-              </w:rPr>
-              <w:t>30</w:t>
-            </w:r>
-          </w:p>
-        </w:tc>
-        <w:tc>
-          <w:tcPr>
-            <w:tcW w:w="1215" w:type="dxa"/>
-            <w:vAlign w:val="center"/>
-          </w:tcPr>
-          <w:p>
-            <w:pPr>
-              <w:spacing w:line="276" w:lineRule="auto"/>
-              <w:jc w:val="center"/>
-            </w:pPr>
-            <w:r>
-              <w:rPr>
-                <w:rFonts w:eastAsia="Times New Roman"/>
-                <w:sz w:val="16"/>
-              </w:rPr>
-              <w:t>8.0105e-220</w:t>
-            </w:r>
-          </w:p>
-        </w:tc>
-        <w:tc>
-          <w:tcPr>
-            <w:tcW w:w="1215" w:type="dxa"/>
-            <w:vAlign w:val="center"/>
-          </w:tcPr>
-          <w:p>
-            <w:pPr>
-              <w:spacing w:line="276" w:lineRule="auto"/>
-              <w:jc w:val="center"/>
-            </w:pPr>
-            <w:r>
-              <w:rPr>
-                <w:rFonts w:eastAsia="Times New Roman"/>
-                <w:sz w:val="16"/>
-              </w:rPr>
-              <w:t>1.0512e-168</w:t>
-            </w:r>
-          </w:p>
-        </w:tc>
-        <w:tc>
-          <w:tcPr>
-            <w:tcW w:w="1215" w:type="dxa"/>
-            <w:vAlign w:val="center"/>
-          </w:tcPr>
-          <w:p>
-            <w:pPr>
-              <w:spacing w:line="276" w:lineRule="auto"/>
-              <w:jc w:val="center"/>
-            </w:pPr>
-            <w:r>
-              <w:rPr>
-                <w:rFonts w:eastAsia="Times New Roman"/>
-                <w:sz w:val="16"/>
+            <w:tcW w:type="dxa" w:w="1214"/>
+          </w:tcPr>
+          <w:p>
+            <w:pPr>
+              <w:spacing w:before="40" w:after="40"/>
+            </w:pPr>
+            <w:r>
+              <w:rPr>
+                <w:rFonts w:ascii="Times New Roman" w:hAnsi="Times New Roman"/>
+                <w:sz w:val="19"/>
+              </w:rPr>
+              <w:t>7.1270e-198</w:t>
+            </w:r>
+          </w:p>
+        </w:tc>
+        <w:tc>
+          <w:tcPr>
+            <w:tcW w:type="dxa" w:w="1214"/>
+          </w:tcPr>
+          <w:p>
+            <w:pPr>
+              <w:spacing w:before="40" w:after="40"/>
+            </w:pPr>
+            <w:r>
+              <w:rPr>
+                <w:rFonts w:ascii="Times New Roman" w:hAnsi="Times New Roman"/>
+                <w:sz w:val="19"/>
+              </w:rPr>
+              <w:t>5.7003e-168</w:t>
+            </w:r>
+          </w:p>
+        </w:tc>
+        <w:tc>
+          <w:tcPr>
+            <w:tcW w:type="dxa" w:w="1214"/>
+          </w:tcPr>
+          <w:p>
+            <w:pPr>
+              <w:spacing w:before="40" w:after="40"/>
+            </w:pPr>
+            <w:r>
+              <w:rPr>
+                <w:rFonts w:ascii="Times New Roman" w:hAnsi="Times New Roman"/>
+                <w:sz w:val="19"/>
               </w:rPr>
               <w:t>0.0000e+00</w:t>
             </w:r>
@@ -3211,41 +3151,35 @@
         </w:tc>
         <w:tc>
           <w:tcPr>
-            <w:tcW w:w="1215" w:type="dxa"/>
-            <w:vAlign w:val="center"/>
-          </w:tcPr>
-          <w:p>
-            <w:pPr>
-              <w:spacing w:line="276" w:lineRule="auto"/>
-              <w:jc w:val="center"/>
-            </w:pPr>
-            <w:r>
-              <w:rPr>
-                <w:rFonts w:eastAsia="Times New Roman"/>
-                <w:sz w:val="16"/>
-              </w:rPr>
-              <w:t>2.8386e-167</w:t>
+            <w:tcW w:type="dxa" w:w="1214"/>
+          </w:tcPr>
+          <w:p>
+            <w:pPr>
+              <w:spacing w:before="40" w:after="40"/>
+            </w:pPr>
+            <w:r>
+              <w:rPr>
+                <w:rFonts w:ascii="Times New Roman" w:hAnsi="Times New Roman"/>
+                <w:sz w:val="19"/>
+              </w:rPr>
+              <w:t>1.6789e-166</w:t>
             </w:r>
           </w:p>
         </w:tc>
       </w:tr>
       <w:tr>
-        <w:trPr>
-          <w:jc w:val="center"/>
-        </w:trPr>
-        <w:tc>
-          <w:tcPr>
-            <w:tcW w:w="1215" w:type="dxa"/>
-            <w:vAlign w:val="center"/>
-          </w:tcPr>
-          <w:p>
-            <w:pPr>
-              <w:spacing w:line="276" w:lineRule="auto"/>
-            </w:pPr>
-            <w:r>
-              <w:rPr>
-                <w:rFonts w:eastAsia="Times New Roman"/>
-                <w:sz w:val="16"/>
+        <w:tc>
+          <w:tcPr>
+            <w:tcW w:type="dxa" w:w="1214"/>
+          </w:tcPr>
+          <w:p>
+            <w:pPr>
+              <w:spacing w:before="40" w:after="40"/>
+            </w:pPr>
+            <w:r>
+              <w:rPr>
+                <w:rFonts w:ascii="Times New Roman" w:hAnsi="Times New Roman"/>
+                <w:sz w:val="19"/>
               </w:rPr>
               <w:t>schwefel_2_22</w:t>
             </w:r>
@@ -3253,37 +3187,33 @@
         </w:tc>
         <w:tc>
           <w:tcPr>
-            <w:tcW w:w="1215" w:type="dxa"/>
-            <w:vAlign w:val="center"/>
-          </w:tcPr>
-          <w:p>
-            <w:pPr>
-              <w:spacing w:line="276" w:lineRule="auto"/>
-              <w:jc w:val="center"/>
-            </w:pPr>
-            <w:r>
-              <w:rPr>
-                <w:rFonts w:eastAsia="Times New Roman"/>
-                <w:sz w:val="16"/>
-              </w:rPr>
-              <w:t>2</w:t>
-            </w:r>
-          </w:p>
-        </w:tc>
-        <w:tc>
-          <w:tcPr>
-            <w:tcW w:w="1215" w:type="dxa"/>
-            <w:vAlign w:val="center"/>
-          </w:tcPr>
-          <w:p>
-            <w:pPr>
-              <w:spacing w:line="276" w:lineRule="auto"/>
-              <w:jc w:val="center"/>
-            </w:pPr>
-            <w:r>
-              <w:rPr>
-                <w:rFonts w:eastAsia="Times New Roman"/>
-                <w:sz w:val="16"/>
+            <w:tcW w:type="dxa" w:w="1212"/>
+          </w:tcPr>
+          <w:p>
+            <w:pPr>
+              <w:spacing w:before="40" w:after="40"/>
+            </w:pPr>
+            <w:r>
+              <w:rPr>
+                <w:rFonts w:ascii="Times New Roman" w:hAnsi="Times New Roman"/>
+                <w:sz w:val="19"/>
+              </w:rPr>
+              <w:t>10</w:t>
+            </w:r>
+          </w:p>
+        </w:tc>
+        <w:tc>
+          <w:tcPr>
+            <w:tcW w:type="dxa" w:w="1212"/>
+          </w:tcPr>
+          <w:p>
+            <w:pPr>
+              <w:spacing w:before="40" w:after="40"/>
+            </w:pPr>
+            <w:r>
+              <w:rPr>
+                <w:rFonts w:ascii="Times New Roman" w:hAnsi="Times New Roman"/>
+                <w:sz w:val="19"/>
               </w:rPr>
               <w:t>30</w:t>
             </w:r>
@@ -3291,98 +3221,86 @@
         </w:tc>
         <w:tc>
           <w:tcPr>
-            <w:tcW w:w="1215" w:type="dxa"/>
-            <w:vAlign w:val="center"/>
-          </w:tcPr>
-          <w:p>
-            <w:pPr>
-              <w:spacing w:line="276" w:lineRule="auto"/>
-              <w:jc w:val="center"/>
-            </w:pPr>
-            <w:r>
-              <w:rPr>
-                <w:rFonts w:eastAsia="Times New Roman"/>
-                <w:sz w:val="16"/>
-              </w:rPr>
-              <w:t>1.7686e-95</w:t>
-            </w:r>
-          </w:p>
-        </w:tc>
-        <w:tc>
-          <w:tcPr>
-            <w:tcW w:w="1215" w:type="dxa"/>
-            <w:vAlign w:val="center"/>
-          </w:tcPr>
-          <w:p>
-            <w:pPr>
-              <w:spacing w:line="276" w:lineRule="auto"/>
-              <w:jc w:val="center"/>
-            </w:pPr>
-            <w:r>
-              <w:rPr>
-                <w:rFonts w:eastAsia="Times New Roman"/>
-                <w:sz w:val="16"/>
-              </w:rPr>
-              <w:t>5.8321e-84</w:t>
-            </w:r>
-          </w:p>
-        </w:tc>
-        <w:tc>
-          <w:tcPr>
-            <w:tcW w:w="1215" w:type="dxa"/>
-            <w:vAlign w:val="center"/>
-          </w:tcPr>
-          <w:p>
-            <w:pPr>
-              <w:spacing w:line="276" w:lineRule="auto"/>
-              <w:jc w:val="center"/>
-            </w:pPr>
-            <w:r>
-              <w:rPr>
-                <w:rFonts w:eastAsia="Times New Roman"/>
-                <w:sz w:val="16"/>
-              </w:rPr>
-              <w:t>3.1372e-83</w:t>
-            </w:r>
-          </w:p>
-        </w:tc>
-        <w:tc>
-          <w:tcPr>
-            <w:tcW w:w="1215" w:type="dxa"/>
-            <w:vAlign w:val="center"/>
-          </w:tcPr>
-          <w:p>
-            <w:pPr>
-              <w:spacing w:line="276" w:lineRule="auto"/>
-              <w:jc w:val="center"/>
-            </w:pPr>
-            <w:r>
-              <w:rPr>
-                <w:rFonts w:eastAsia="Times New Roman"/>
-                <w:sz w:val="16"/>
-              </w:rPr>
-              <w:t>1.7477e-82</w:t>
+            <w:tcW w:type="dxa" w:w="1214"/>
+          </w:tcPr>
+          <w:p>
+            <w:pPr>
+              <w:spacing w:before="40" w:after="40"/>
+            </w:pPr>
+            <w:r>
+              <w:rPr>
+                <w:rFonts w:ascii="Times New Roman" w:hAnsi="Times New Roman"/>
+                <w:sz w:val="19"/>
+              </w:rPr>
+              <w:t>2.4578e-106</w:t>
+            </w:r>
+          </w:p>
+        </w:tc>
+        <w:tc>
+          <w:tcPr>
+            <w:tcW w:type="dxa" w:w="1214"/>
+          </w:tcPr>
+          <w:p>
+            <w:pPr>
+              <w:spacing w:before="40" w:after="40"/>
+            </w:pPr>
+            <w:r>
+              <w:rPr>
+                <w:rFonts w:ascii="Times New Roman" w:hAnsi="Times New Roman"/>
+                <w:sz w:val="19"/>
+              </w:rPr>
+              <w:t>6.7026e-82</w:t>
+            </w:r>
+          </w:p>
+        </w:tc>
+        <w:tc>
+          <w:tcPr>
+            <w:tcW w:type="dxa" w:w="1214"/>
+          </w:tcPr>
+          <w:p>
+            <w:pPr>
+              <w:spacing w:before="40" w:after="40"/>
+            </w:pPr>
+            <w:r>
+              <w:rPr>
+                <w:rFonts w:ascii="Times New Roman" w:hAnsi="Times New Roman"/>
+                <w:sz w:val="19"/>
+              </w:rPr>
+              <w:t>3.6095e-81</w:t>
+            </w:r>
+          </w:p>
+        </w:tc>
+        <w:tc>
+          <w:tcPr>
+            <w:tcW w:type="dxa" w:w="1214"/>
+          </w:tcPr>
+          <w:p>
+            <w:pPr>
+              <w:spacing w:before="40" w:after="40"/>
+            </w:pPr>
+            <w:r>
+              <w:rPr>
+                <w:rFonts w:ascii="Times New Roman" w:hAnsi="Times New Roman"/>
+                <w:sz w:val="19"/>
+              </w:rPr>
+              <w:t>2.0108e-80</w:t>
             </w:r>
           </w:p>
         </w:tc>
       </w:tr>
       <w:tr>
-        <w:trPr>
-          <w:jc w:val="center"/>
-        </w:trPr>
-        <w:tc>
-          <w:tcPr>
-            <w:tcW w:w="1215" w:type="dxa"/>
-            <w:vAlign w:val="center"/>
-          </w:tcPr>
-          <w:p>
-            <w:pPr>
-              <w:spacing w:line="276" w:lineRule="auto"/>
-            </w:pPr>
-            <w:r>
-              <w:rPr>
-                <w:rFonts w:eastAsia="Times New Roman"/>
-                <w:sz w:val="16"/>
+        <w:tc>
+          <w:tcPr>
+            <w:tcW w:type="dxa" w:w="1214"/>
+          </w:tcPr>
+          <w:p>
+            <w:pPr>
+              <w:spacing w:before="40" w:after="40"/>
+            </w:pPr>
+            <w:r>
+              <w:rPr>
+                <w:rFonts w:ascii="Times New Roman" w:hAnsi="Times New Roman"/>
+                <w:sz w:val="19"/>
               </w:rPr>
               <w:t>schwefel_2_22</w:t>
             </w:r>
@@ -3390,37 +3308,16 @@
         </w:tc>
         <w:tc>
           <w:tcPr>
-            <w:tcW w:w="1215" w:type="dxa"/>
-            <w:vAlign w:val="center"/>
-          </w:tcPr>
-          <w:p>
-            <w:pPr>
-              <w:spacing w:line="276" w:lineRule="auto"/>
-              <w:jc w:val="center"/>
-            </w:pPr>
-            <w:r>
-              <w:rPr>
-                <w:rFonts w:eastAsia="Times New Roman"/>
-                <w:sz w:val="16"/>
-              </w:rPr>
-              <w:t>10</w:t>
-            </w:r>
-          </w:p>
-        </w:tc>
-        <w:tc>
-          <w:tcPr>
-            <w:tcW w:w="1215" w:type="dxa"/>
-            <w:vAlign w:val="center"/>
-          </w:tcPr>
-          <w:p>
-            <w:pPr>
-              <w:spacing w:line="276" w:lineRule="auto"/>
-              <w:jc w:val="center"/>
-            </w:pPr>
-            <w:r>
-              <w:rPr>
-                <w:rFonts w:eastAsia="Times New Roman"/>
-                <w:sz w:val="16"/>
+            <w:tcW w:type="dxa" w:w="1212"/>
+          </w:tcPr>
+          <w:p>
+            <w:pPr>
+              <w:spacing w:before="40" w:after="40"/>
+            </w:pPr>
+            <w:r>
+              <w:rPr>
+                <w:rFonts w:ascii="Times New Roman" w:hAnsi="Times New Roman"/>
+                <w:sz w:val="19"/>
               </w:rPr>
               <w:t>30</w:t>
             </w:r>
@@ -3428,98 +3325,103 @@
         </w:tc>
         <w:tc>
           <w:tcPr>
-            <w:tcW w:w="1215" w:type="dxa"/>
-            <w:vAlign w:val="center"/>
-          </w:tcPr>
-          <w:p>
-            <w:pPr>
-              <w:spacing w:line="276" w:lineRule="auto"/>
-              <w:jc w:val="center"/>
-            </w:pPr>
-            <w:r>
-              <w:rPr>
-                <w:rFonts w:eastAsia="Times New Roman"/>
-                <w:sz w:val="16"/>
-              </w:rPr>
-              <w:t>9.9389e-110</w:t>
-            </w:r>
-          </w:p>
-        </w:tc>
-        <w:tc>
-          <w:tcPr>
-            <w:tcW w:w="1215" w:type="dxa"/>
-            <w:vAlign w:val="center"/>
-          </w:tcPr>
-          <w:p>
-            <w:pPr>
-              <w:spacing w:line="276" w:lineRule="auto"/>
-              <w:jc w:val="center"/>
-            </w:pPr>
-            <w:r>
-              <w:rPr>
-                <w:rFonts w:eastAsia="Times New Roman"/>
-                <w:sz w:val="16"/>
-              </w:rPr>
-              <w:t>3.0422e-79</w:t>
-            </w:r>
-          </w:p>
-        </w:tc>
-        <w:tc>
-          <w:tcPr>
-            <w:tcW w:w="1215" w:type="dxa"/>
-            <w:vAlign w:val="center"/>
-          </w:tcPr>
-          <w:p>
-            <w:pPr>
-              <w:spacing w:line="276" w:lineRule="auto"/>
-              <w:jc w:val="center"/>
-            </w:pPr>
-            <w:r>
-              <w:rPr>
-                <w:rFonts w:eastAsia="Times New Roman"/>
-                <w:sz w:val="16"/>
-              </w:rPr>
-              <w:t>1.6379e-78</w:t>
-            </w:r>
-          </w:p>
-        </w:tc>
-        <w:tc>
-          <w:tcPr>
-            <w:tcW w:w="1215" w:type="dxa"/>
-            <w:vAlign w:val="center"/>
-          </w:tcPr>
-          <w:p>
-            <w:pPr>
-              <w:spacing w:line="276" w:lineRule="auto"/>
-              <w:jc w:val="center"/>
-            </w:pPr>
-            <w:r>
-              <w:rPr>
-                <w:rFonts w:eastAsia="Times New Roman"/>
-                <w:sz w:val="16"/>
-              </w:rPr>
-              <w:t>9.1245e-78</w:t>
+            <w:tcW w:type="dxa" w:w="1212"/>
+          </w:tcPr>
+          <w:p>
+            <w:pPr>
+              <w:spacing w:before="40" w:after="40"/>
+            </w:pPr>
+            <w:r>
+              <w:rPr>
+                <w:rFonts w:ascii="Times New Roman" w:hAnsi="Times New Roman"/>
+                <w:sz w:val="19"/>
+              </w:rPr>
+              <w:t>30</w:t>
+            </w:r>
+          </w:p>
+        </w:tc>
+        <w:tc>
+          <w:tcPr>
+            <w:tcW w:type="dxa" w:w="1214"/>
+          </w:tcPr>
+          <w:p>
+            <w:pPr>
+              <w:spacing w:before="40" w:after="40"/>
+            </w:pPr>
+            <w:r>
+              <w:rPr>
+                <w:rFonts w:ascii="Times New Roman" w:hAnsi="Times New Roman"/>
+                <w:sz w:val="19"/>
+              </w:rPr>
+              <w:t>4.1779e-103</w:t>
+            </w:r>
+          </w:p>
+        </w:tc>
+        <w:tc>
+          <w:tcPr>
+            <w:tcW w:type="dxa" w:w="1214"/>
+          </w:tcPr>
+          <w:p>
+            <w:pPr>
+              <w:spacing w:before="40" w:after="40"/>
+            </w:pPr>
+            <w:r>
+              <w:rPr>
+                <w:rFonts w:ascii="Times New Roman" w:hAnsi="Times New Roman"/>
+                <w:sz w:val="19"/>
+              </w:rPr>
+              <w:t>3.6040e-87</w:t>
+            </w:r>
+          </w:p>
+        </w:tc>
+        <w:tc>
+          <w:tcPr>
+            <w:tcW w:type="dxa" w:w="1214"/>
+          </w:tcPr>
+          <w:p>
+            <w:pPr>
+              <w:spacing w:before="40" w:after="40"/>
+            </w:pPr>
+            <w:r>
+              <w:rPr>
+                <w:rFonts w:ascii="Times New Roman" w:hAnsi="Times New Roman"/>
+                <w:sz w:val="19"/>
+              </w:rPr>
+              <w:t>1.0325e-86</w:t>
+            </w:r>
+          </w:p>
+        </w:tc>
+        <w:tc>
+          <w:tcPr>
+            <w:tcW w:type="dxa" w:w="1214"/>
+          </w:tcPr>
+          <w:p>
+            <w:pPr>
+              <w:spacing w:before="40" w:after="40"/>
+            </w:pPr>
+            <w:r>
+              <w:rPr>
+                <w:rFonts w:ascii="Times New Roman" w:hAnsi="Times New Roman"/>
+                <w:sz w:val="19"/>
+              </w:rPr>
+              <w:t>4.0626e-86</w:t>
             </w:r>
           </w:p>
         </w:tc>
       </w:tr>
       <w:tr>
-        <w:trPr>
-          <w:jc w:val="center"/>
-        </w:trPr>
-        <w:tc>
-          <w:tcPr>
-            <w:tcW w:w="1215" w:type="dxa"/>
-            <w:vAlign w:val="center"/>
-          </w:tcPr>
-          <w:p>
-            <w:pPr>
-              <w:spacing w:line="276" w:lineRule="auto"/>
-            </w:pPr>
-            <w:r>
-              <w:rPr>
-                <w:rFonts w:eastAsia="Times New Roman"/>
-                <w:sz w:val="16"/>
+        <w:tc>
+          <w:tcPr>
+            <w:tcW w:type="dxa" w:w="1214"/>
+          </w:tcPr>
+          <w:p>
+            <w:pPr>
+              <w:spacing w:before="40" w:after="40"/>
+            </w:pPr>
+            <w:r>
+              <w:rPr>
+                <w:rFonts w:ascii="Times New Roman" w:hAnsi="Times New Roman"/>
+                <w:sz w:val="19"/>
               </w:rPr>
               <w:t>schwefel_2_22</w:t>
             </w:r>
@@ -3527,18 +3429,33 @@
         </w:tc>
         <w:tc>
           <w:tcPr>
-            <w:tcW w:w="1215" w:type="dxa"/>
-            <w:vAlign w:val="center"/>
-          </w:tcPr>
-          <w:p>
-            <w:pPr>
-              <w:spacing w:line="276" w:lineRule="auto"/>
-              <w:jc w:val="center"/>
-            </w:pPr>
-            <w:r>
-              <w:rPr>
-                <w:rFonts w:eastAsia="Times New Roman"/>
-                <w:sz w:val="16"/>
+            <w:tcW w:type="dxa" w:w="1212"/>
+          </w:tcPr>
+          <w:p>
+            <w:pPr>
+              <w:spacing w:before="40" w:after="40"/>
+            </w:pPr>
+            <w:r>
+              <w:rPr>
+                <w:rFonts w:ascii="Times New Roman" w:hAnsi="Times New Roman"/>
+                <w:sz w:val="19"/>
+              </w:rPr>
+              <w:t>50</w:t>
+            </w:r>
+          </w:p>
+        </w:tc>
+        <w:tc>
+          <w:tcPr>
+            <w:tcW w:type="dxa" w:w="1212"/>
+          </w:tcPr>
+          <w:p>
+            <w:pPr>
+              <w:spacing w:before="40" w:after="40"/>
+            </w:pPr>
+            <w:r>
+              <w:rPr>
+                <w:rFonts w:ascii="Times New Roman" w:hAnsi="Times New Roman"/>
+                <w:sz w:val="19"/>
               </w:rPr>
               <w:t>30</w:t>
             </w:r>
@@ -3546,117 +3463,86 @@
         </w:tc>
         <w:tc>
           <w:tcPr>
-            <w:tcW w:w="1215" w:type="dxa"/>
-            <w:vAlign w:val="center"/>
-          </w:tcPr>
-          <w:p>
-            <w:pPr>
-              <w:spacing w:line="276" w:lineRule="auto"/>
-              <w:jc w:val="center"/>
-            </w:pPr>
-            <w:r>
-              <w:rPr>
-                <w:rFonts w:eastAsia="Times New Roman"/>
-                <w:sz w:val="16"/>
-              </w:rPr>
-              <w:t>30</w:t>
-            </w:r>
-          </w:p>
-        </w:tc>
-        <w:tc>
-          <w:tcPr>
-            <w:tcW w:w="1215" w:type="dxa"/>
-            <w:vAlign w:val="center"/>
-          </w:tcPr>
-          <w:p>
-            <w:pPr>
-              <w:spacing w:line="276" w:lineRule="auto"/>
-              <w:jc w:val="center"/>
-            </w:pPr>
-            <w:r>
-              <w:rPr>
-                <w:rFonts w:eastAsia="Times New Roman"/>
-                <w:sz w:val="16"/>
-              </w:rPr>
-              <w:t>1.6405e-102</w:t>
-            </w:r>
-          </w:p>
-        </w:tc>
-        <w:tc>
-          <w:tcPr>
-            <w:tcW w:w="1215" w:type="dxa"/>
-            <w:vAlign w:val="center"/>
-          </w:tcPr>
-          <w:p>
-            <w:pPr>
-              <w:spacing w:line="276" w:lineRule="auto"/>
-              <w:jc w:val="center"/>
-            </w:pPr>
-            <w:r>
-              <w:rPr>
-                <w:rFonts w:eastAsia="Times New Roman"/>
-                <w:sz w:val="16"/>
-              </w:rPr>
-              <w:t>1.0315e-76</w:t>
-            </w:r>
-          </w:p>
-        </w:tc>
-        <w:tc>
-          <w:tcPr>
-            <w:tcW w:w="1215" w:type="dxa"/>
-            <w:vAlign w:val="center"/>
-          </w:tcPr>
-          <w:p>
-            <w:pPr>
-              <w:spacing w:line="276" w:lineRule="auto"/>
-              <w:jc w:val="center"/>
-            </w:pPr>
-            <w:r>
-              <w:rPr>
-                <w:rFonts w:eastAsia="Times New Roman"/>
-                <w:sz w:val="16"/>
-              </w:rPr>
-              <w:t>5.5494e-76</w:t>
-            </w:r>
-          </w:p>
-        </w:tc>
-        <w:tc>
-          <w:tcPr>
-            <w:tcW w:w="1215" w:type="dxa"/>
-            <w:vAlign w:val="center"/>
-          </w:tcPr>
-          <w:p>
-            <w:pPr>
-              <w:spacing w:line="276" w:lineRule="auto"/>
-              <w:jc w:val="center"/>
-            </w:pPr>
-            <w:r>
-              <w:rPr>
-                <w:rFonts w:eastAsia="Times New Roman"/>
-                <w:sz w:val="16"/>
-              </w:rPr>
-              <w:t>3.0916e-75</w:t>
+            <w:tcW w:type="dxa" w:w="1214"/>
+          </w:tcPr>
+          <w:p>
+            <w:pPr>
+              <w:spacing w:before="40" w:after="40"/>
+            </w:pPr>
+            <w:r>
+              <w:rPr>
+                <w:rFonts w:ascii="Times New Roman" w:hAnsi="Times New Roman"/>
+                <w:sz w:val="19"/>
+              </w:rPr>
+              <w:t>2.0273e-103</w:t>
+            </w:r>
+          </w:p>
+        </w:tc>
+        <w:tc>
+          <w:tcPr>
+            <w:tcW w:type="dxa" w:w="1214"/>
+          </w:tcPr>
+          <w:p>
+            <w:pPr>
+              <w:spacing w:before="40" w:after="40"/>
+            </w:pPr>
+            <w:r>
+              <w:rPr>
+                <w:rFonts w:ascii="Times New Roman" w:hAnsi="Times New Roman"/>
+                <w:sz w:val="19"/>
+              </w:rPr>
+              <w:t>4.1842e-82</w:t>
+            </w:r>
+          </w:p>
+        </w:tc>
+        <w:tc>
+          <w:tcPr>
+            <w:tcW w:type="dxa" w:w="1214"/>
+          </w:tcPr>
+          <w:p>
+            <w:pPr>
+              <w:spacing w:before="40" w:after="40"/>
+            </w:pPr>
+            <w:r>
+              <w:rPr>
+                <w:rFonts w:ascii="Times New Roman" w:hAnsi="Times New Roman"/>
+                <w:sz w:val="19"/>
+              </w:rPr>
+              <w:t>1.8868e-81</w:t>
+            </w:r>
+          </w:p>
+        </w:tc>
+        <w:tc>
+          <w:tcPr>
+            <w:tcW w:type="dxa" w:w="1214"/>
+          </w:tcPr>
+          <w:p>
+            <w:pPr>
+              <w:spacing w:before="40" w:after="40"/>
+            </w:pPr>
+            <w:r>
+              <w:rPr>
+                <w:rFonts w:ascii="Times New Roman" w:hAnsi="Times New Roman"/>
+                <w:sz w:val="19"/>
+              </w:rPr>
+              <w:t>1.0355e-80</w:t>
             </w:r>
           </w:p>
         </w:tc>
       </w:tr>
       <w:tr>
-        <w:trPr>
-          <w:jc w:val="center"/>
-        </w:trPr>
-        <w:tc>
-          <w:tcPr>
-            <w:tcW w:w="1215" w:type="dxa"/>
-            <w:vAlign w:val="center"/>
-          </w:tcPr>
-          <w:p>
-            <w:pPr>
-              <w:spacing w:line="276" w:lineRule="auto"/>
-            </w:pPr>
-            <w:r>
-              <w:rPr>
-                <w:rFonts w:eastAsia="Times New Roman"/>
-                <w:sz w:val="16"/>
+        <w:tc>
+          <w:tcPr>
+            <w:tcW w:type="dxa" w:w="1214"/>
+          </w:tcPr>
+          <w:p>
+            <w:pPr>
+              <w:spacing w:before="40" w:after="40"/>
+            </w:pPr>
+            <w:r>
+              <w:rPr>
+                <w:rFonts w:ascii="Times New Roman" w:hAnsi="Times New Roman"/>
+                <w:sz w:val="19"/>
               </w:rPr>
               <w:t>rosenbrock</w:t>
             </w:r>
@@ -3664,37 +3550,33 @@
         </w:tc>
         <w:tc>
           <w:tcPr>
-            <w:tcW w:w="1215" w:type="dxa"/>
-            <w:vAlign w:val="center"/>
-          </w:tcPr>
-          <w:p>
-            <w:pPr>
-              <w:spacing w:line="276" w:lineRule="auto"/>
-              <w:jc w:val="center"/>
-            </w:pPr>
-            <w:r>
-              <w:rPr>
-                <w:rFonts w:eastAsia="Times New Roman"/>
-                <w:sz w:val="16"/>
-              </w:rPr>
-              <w:t>2</w:t>
-            </w:r>
-          </w:p>
-        </w:tc>
-        <w:tc>
-          <w:tcPr>
-            <w:tcW w:w="1215" w:type="dxa"/>
-            <w:vAlign w:val="center"/>
-          </w:tcPr>
-          <w:p>
-            <w:pPr>
-              <w:spacing w:line="276" w:lineRule="auto"/>
-              <w:jc w:val="center"/>
-            </w:pPr>
-            <w:r>
-              <w:rPr>
-                <w:rFonts w:eastAsia="Times New Roman"/>
-                <w:sz w:val="16"/>
+            <w:tcW w:type="dxa" w:w="1212"/>
+          </w:tcPr>
+          <w:p>
+            <w:pPr>
+              <w:spacing w:before="40" w:after="40"/>
+            </w:pPr>
+            <w:r>
+              <w:rPr>
+                <w:rFonts w:ascii="Times New Roman" w:hAnsi="Times New Roman"/>
+                <w:sz w:val="19"/>
+              </w:rPr>
+              <w:t>10</w:t>
+            </w:r>
+          </w:p>
+        </w:tc>
+        <w:tc>
+          <w:tcPr>
+            <w:tcW w:type="dxa" w:w="1212"/>
+          </w:tcPr>
+          <w:p>
+            <w:pPr>
+              <w:spacing w:before="40" w:after="40"/>
+            </w:pPr>
+            <w:r>
+              <w:rPr>
+                <w:rFonts w:ascii="Times New Roman" w:hAnsi="Times New Roman"/>
+                <w:sz w:val="19"/>
               </w:rPr>
               <w:t>30</w:t>
             </w:r>
@@ -3702,98 +3584,86 @@
         </w:tc>
         <w:tc>
           <w:tcPr>
-            <w:tcW w:w="1215" w:type="dxa"/>
-            <w:vAlign w:val="center"/>
-          </w:tcPr>
-          <w:p>
-            <w:pPr>
-              <w:spacing w:line="276" w:lineRule="auto"/>
-              <w:jc w:val="center"/>
-            </w:pPr>
-            <w:r>
-              <w:rPr>
-                <w:rFonts w:eastAsia="Times New Roman"/>
-                <w:sz w:val="16"/>
-              </w:rPr>
-              <w:t>1.0448e-18</w:t>
-            </w:r>
-          </w:p>
-        </w:tc>
-        <w:tc>
-          <w:tcPr>
-            <w:tcW w:w="1215" w:type="dxa"/>
-            <w:vAlign w:val="center"/>
-          </w:tcPr>
-          <w:p>
-            <w:pPr>
-              <w:spacing w:line="276" w:lineRule="auto"/>
-              <w:jc w:val="center"/>
-            </w:pPr>
-            <w:r>
-              <w:rPr>
-                <w:rFonts w:eastAsia="Times New Roman"/>
-                <w:sz w:val="16"/>
-              </w:rPr>
-              <w:t>8.6498e-07</w:t>
-            </w:r>
-          </w:p>
-        </w:tc>
-        <w:tc>
-          <w:tcPr>
-            <w:tcW w:w="1215" w:type="dxa"/>
-            <w:vAlign w:val="center"/>
-          </w:tcPr>
-          <w:p>
-            <w:pPr>
-              <w:spacing w:line="276" w:lineRule="auto"/>
-              <w:jc w:val="center"/>
-            </w:pPr>
-            <w:r>
-              <w:rPr>
-                <w:rFonts w:eastAsia="Times New Roman"/>
-                <w:sz w:val="16"/>
-              </w:rPr>
-              <w:t>2.7828e-06</w:t>
-            </w:r>
-          </w:p>
-        </w:tc>
-        <w:tc>
-          <w:tcPr>
-            <w:tcW w:w="1215" w:type="dxa"/>
-            <w:vAlign w:val="center"/>
-          </w:tcPr>
-          <w:p>
-            <w:pPr>
-              <w:spacing w:line="276" w:lineRule="auto"/>
-              <w:jc w:val="center"/>
-            </w:pPr>
-            <w:r>
-              <w:rPr>
-                <w:rFonts w:eastAsia="Times New Roman"/>
-                <w:sz w:val="16"/>
-              </w:rPr>
-              <w:t>1.2754e-05</w:t>
+            <w:tcW w:type="dxa" w:w="1214"/>
+          </w:tcPr>
+          <w:p>
+            <w:pPr>
+              <w:spacing w:before="40" w:after="40"/>
+            </w:pPr>
+            <w:r>
+              <w:rPr>
+                <w:rFonts w:ascii="Times New Roman" w:hAnsi="Times New Roman"/>
+                <w:sz w:val="19"/>
+              </w:rPr>
+              <w:t>4.7525e+00</w:t>
+            </w:r>
+          </w:p>
+        </w:tc>
+        <w:tc>
+          <w:tcPr>
+            <w:tcW w:type="dxa" w:w="1214"/>
+          </w:tcPr>
+          <w:p>
+            <w:pPr>
+              <w:spacing w:before="40" w:after="40"/>
+            </w:pPr>
+            <w:r>
+              <w:rPr>
+                <w:rFonts w:ascii="Times New Roman" w:hAnsi="Times New Roman"/>
+                <w:sz w:val="19"/>
+              </w:rPr>
+              <w:t>5.6108e+00</w:t>
+            </w:r>
+          </w:p>
+        </w:tc>
+        <w:tc>
+          <w:tcPr>
+            <w:tcW w:type="dxa" w:w="1214"/>
+          </w:tcPr>
+          <w:p>
+            <w:pPr>
+              <w:spacing w:before="40" w:after="40"/>
+            </w:pPr>
+            <w:r>
+              <w:rPr>
+                <w:rFonts w:ascii="Times New Roman" w:hAnsi="Times New Roman"/>
+                <w:sz w:val="19"/>
+              </w:rPr>
+              <w:t>6.8869e-01</w:t>
+            </w:r>
+          </w:p>
+        </w:tc>
+        <w:tc>
+          <w:tcPr>
+            <w:tcW w:type="dxa" w:w="1214"/>
+          </w:tcPr>
+          <w:p>
+            <w:pPr>
+              <w:spacing w:before="40" w:after="40"/>
+            </w:pPr>
+            <w:r>
+              <w:rPr>
+                <w:rFonts w:ascii="Times New Roman" w:hAnsi="Times New Roman"/>
+                <w:sz w:val="19"/>
+              </w:rPr>
+              <w:t>8.9580e+00</w:t>
             </w:r>
           </w:p>
         </w:tc>
       </w:tr>
       <w:tr>
-        <w:trPr>
-          <w:jc w:val="center"/>
-        </w:trPr>
-        <w:tc>
-          <w:tcPr>
-            <w:tcW w:w="1215" w:type="dxa"/>
-            <w:vAlign w:val="center"/>
-          </w:tcPr>
-          <w:p>
-            <w:pPr>
-              <w:spacing w:line="276" w:lineRule="auto"/>
-            </w:pPr>
-            <w:r>
-              <w:rPr>
-                <w:rFonts w:eastAsia="Times New Roman"/>
-                <w:sz w:val="16"/>
+        <w:tc>
+          <w:tcPr>
+            <w:tcW w:type="dxa" w:w="1214"/>
+          </w:tcPr>
+          <w:p>
+            <w:pPr>
+              <w:spacing w:before="40" w:after="40"/>
+            </w:pPr>
+            <w:r>
+              <w:rPr>
+                <w:rFonts w:ascii="Times New Roman" w:hAnsi="Times New Roman"/>
+                <w:sz w:val="19"/>
               </w:rPr>
               <w:t>rosenbrock</w:t>
             </w:r>
@@ -3801,37 +3671,16 @@
         </w:tc>
         <w:tc>
           <w:tcPr>
-            <w:tcW w:w="1215" w:type="dxa"/>
-            <w:vAlign w:val="center"/>
-          </w:tcPr>
-          <w:p>
-            <w:pPr>
-              <w:spacing w:line="276" w:lineRule="auto"/>
-              <w:jc w:val="center"/>
-            </w:pPr>
-            <w:r>
-              <w:rPr>
-                <w:rFonts w:eastAsia="Times New Roman"/>
-                <w:sz w:val="16"/>
-              </w:rPr>
-              <w:t>10</w:t>
-            </w:r>
-          </w:p>
-        </w:tc>
-        <w:tc>
-          <w:tcPr>
-            <w:tcW w:w="1215" w:type="dxa"/>
-            <w:vAlign w:val="center"/>
-          </w:tcPr>
-          <w:p>
-            <w:pPr>
-              <w:spacing w:line="276" w:lineRule="auto"/>
-              <w:jc w:val="center"/>
-            </w:pPr>
-            <w:r>
-              <w:rPr>
-                <w:rFonts w:eastAsia="Times New Roman"/>
-                <w:sz w:val="16"/>
+            <w:tcW w:type="dxa" w:w="1212"/>
+          </w:tcPr>
+          <w:p>
+            <w:pPr>
+              <w:spacing w:before="40" w:after="40"/>
+            </w:pPr>
+            <w:r>
+              <w:rPr>
+                <w:rFonts w:ascii="Times New Roman" w:hAnsi="Times New Roman"/>
+                <w:sz w:val="19"/>
               </w:rPr>
               <w:t>30</w:t>
             </w:r>
@@ -3839,98 +3688,103 @@
         </w:tc>
         <w:tc>
           <w:tcPr>
-            <w:tcW w:w="1215" w:type="dxa"/>
-            <w:vAlign w:val="center"/>
-          </w:tcPr>
-          <w:p>
-            <w:pPr>
-              <w:spacing w:line="276" w:lineRule="auto"/>
-              <w:jc w:val="center"/>
-            </w:pPr>
-            <w:r>
-              <w:rPr>
-                <w:rFonts w:eastAsia="Times New Roman"/>
-                <w:sz w:val="16"/>
-              </w:rPr>
-              <w:t>5.3836e-01</w:t>
-            </w:r>
-          </w:p>
-        </w:tc>
-        <w:tc>
-          <w:tcPr>
-            <w:tcW w:w="1215" w:type="dxa"/>
-            <w:vAlign w:val="center"/>
-          </w:tcPr>
-          <w:p>
-            <w:pPr>
-              <w:spacing w:line="276" w:lineRule="auto"/>
-              <w:jc w:val="center"/>
-            </w:pPr>
-            <w:r>
-              <w:rPr>
-                <w:rFonts w:eastAsia="Times New Roman"/>
-                <w:sz w:val="16"/>
-              </w:rPr>
-              <w:t>5.2808e+00</w:t>
-            </w:r>
-          </w:p>
-        </w:tc>
-        <w:tc>
-          <w:tcPr>
-            <w:tcW w:w="1215" w:type="dxa"/>
-            <w:vAlign w:val="center"/>
-          </w:tcPr>
-          <w:p>
-            <w:pPr>
-              <w:spacing w:line="276" w:lineRule="auto"/>
-              <w:jc w:val="center"/>
-            </w:pPr>
-            <w:r>
-              <w:rPr>
-                <w:rFonts w:eastAsia="Times New Roman"/>
-                <w:sz w:val="16"/>
-              </w:rPr>
-              <w:t>9.3028e-01</w:t>
-            </w:r>
-          </w:p>
-        </w:tc>
-        <w:tc>
-          <w:tcPr>
-            <w:tcW w:w="1215" w:type="dxa"/>
-            <w:vAlign w:val="center"/>
-          </w:tcPr>
-          <w:p>
-            <w:pPr>
-              <w:spacing w:line="276" w:lineRule="auto"/>
-              <w:jc w:val="center"/>
-            </w:pPr>
-            <w:r>
-              <w:rPr>
-                <w:rFonts w:eastAsia="Times New Roman"/>
-                <w:sz w:val="16"/>
-              </w:rPr>
-              <w:t>6.2839e+00</w:t>
+            <w:tcW w:type="dxa" w:w="1212"/>
+          </w:tcPr>
+          <w:p>
+            <w:pPr>
+              <w:spacing w:before="40" w:after="40"/>
+            </w:pPr>
+            <w:r>
+              <w:rPr>
+                <w:rFonts w:ascii="Times New Roman" w:hAnsi="Times New Roman"/>
+                <w:sz w:val="19"/>
+              </w:rPr>
+              <w:t>30</w:t>
+            </w:r>
+          </w:p>
+        </w:tc>
+        <w:tc>
+          <w:tcPr>
+            <w:tcW w:type="dxa" w:w="1214"/>
+          </w:tcPr>
+          <w:p>
+            <w:pPr>
+              <w:spacing w:before="40" w:after="40"/>
+            </w:pPr>
+            <w:r>
+              <w:rPr>
+                <w:rFonts w:ascii="Times New Roman" w:hAnsi="Times New Roman"/>
+                <w:sz w:val="19"/>
+              </w:rPr>
+              <w:t>2.5593e+01</w:t>
+            </w:r>
+          </w:p>
+        </w:tc>
+        <w:tc>
+          <w:tcPr>
+            <w:tcW w:type="dxa" w:w="1214"/>
+          </w:tcPr>
+          <w:p>
+            <w:pPr>
+              <w:spacing w:before="40" w:after="40"/>
+            </w:pPr>
+            <w:r>
+              <w:rPr>
+                <w:rFonts w:ascii="Times New Roman" w:hAnsi="Times New Roman"/>
+                <w:sz w:val="19"/>
+              </w:rPr>
+              <w:t>2.6229e+01</w:t>
+            </w:r>
+          </w:p>
+        </w:tc>
+        <w:tc>
+          <w:tcPr>
+            <w:tcW w:type="dxa" w:w="1214"/>
+          </w:tcPr>
+          <w:p>
+            <w:pPr>
+              <w:spacing w:before="40" w:after="40"/>
+            </w:pPr>
+            <w:r>
+              <w:rPr>
+                <w:rFonts w:ascii="Times New Roman" w:hAnsi="Times New Roman"/>
+                <w:sz w:val="19"/>
+              </w:rPr>
+              <w:t>2.5323e-01</w:t>
+            </w:r>
+          </w:p>
+        </w:tc>
+        <w:tc>
+          <w:tcPr>
+            <w:tcW w:type="dxa" w:w="1214"/>
+          </w:tcPr>
+          <w:p>
+            <w:pPr>
+              <w:spacing w:before="40" w:after="40"/>
+            </w:pPr>
+            <w:r>
+              <w:rPr>
+                <w:rFonts w:ascii="Times New Roman" w:hAnsi="Times New Roman"/>
+                <w:sz w:val="19"/>
+              </w:rPr>
+              <w:t>2.6714e+01</w:t>
             </w:r>
           </w:p>
         </w:tc>
       </w:tr>
       <w:tr>
-        <w:trPr>
-          <w:jc w:val="center"/>
-        </w:trPr>
-        <w:tc>
-          <w:tcPr>
-            <w:tcW w:w="1215" w:type="dxa"/>
-            <w:vAlign w:val="center"/>
-          </w:tcPr>
-          <w:p>
-            <w:pPr>
-              <w:spacing w:line="276" w:lineRule="auto"/>
-            </w:pPr>
-            <w:r>
-              <w:rPr>
-                <w:rFonts w:eastAsia="Times New Roman"/>
-                <w:sz w:val="16"/>
+        <w:tc>
+          <w:tcPr>
+            <w:tcW w:type="dxa" w:w="1214"/>
+          </w:tcPr>
+          <w:p>
+            <w:pPr>
+              <w:spacing w:before="40" w:after="40"/>
+            </w:pPr>
+            <w:r>
+              <w:rPr>
+                <w:rFonts w:ascii="Times New Roman" w:hAnsi="Times New Roman"/>
+                <w:sz w:val="19"/>
               </w:rPr>
               <w:t>rosenbrock</w:t>
             </w:r>
@@ -3938,18 +3792,33 @@
         </w:tc>
         <w:tc>
           <w:tcPr>
-            <w:tcW w:w="1215" w:type="dxa"/>
-            <w:vAlign w:val="center"/>
-          </w:tcPr>
-          <w:p>
-            <w:pPr>
-              <w:spacing w:line="276" w:lineRule="auto"/>
-              <w:jc w:val="center"/>
-            </w:pPr>
-            <w:r>
-              <w:rPr>
-                <w:rFonts w:eastAsia="Times New Roman"/>
-                <w:sz w:val="16"/>
+            <w:tcW w:type="dxa" w:w="1212"/>
+          </w:tcPr>
+          <w:p>
+            <w:pPr>
+              <w:spacing w:before="40" w:after="40"/>
+            </w:pPr>
+            <w:r>
+              <w:rPr>
+                <w:rFonts w:ascii="Times New Roman" w:hAnsi="Times New Roman"/>
+                <w:sz w:val="19"/>
+              </w:rPr>
+              <w:t>50</w:t>
+            </w:r>
+          </w:p>
+        </w:tc>
+        <w:tc>
+          <w:tcPr>
+            <w:tcW w:type="dxa" w:w="1212"/>
+          </w:tcPr>
+          <w:p>
+            <w:pPr>
+              <w:spacing w:before="40" w:after="40"/>
+            </w:pPr>
+            <w:r>
+              <w:rPr>
+                <w:rFonts w:ascii="Times New Roman" w:hAnsi="Times New Roman"/>
+                <w:sz w:val="19"/>
               </w:rPr>
               <w:t>30</w:t>
             </w:r>
@@ -3957,117 +3826,86 @@
         </w:tc>
         <w:tc>
           <w:tcPr>
-            <w:tcW w:w="1215" w:type="dxa"/>
-            <w:vAlign w:val="center"/>
-          </w:tcPr>
-          <w:p>
-            <w:pPr>
-              <w:spacing w:line="276" w:lineRule="auto"/>
-              <w:jc w:val="center"/>
-            </w:pPr>
-            <w:r>
-              <w:rPr>
-                <w:rFonts w:eastAsia="Times New Roman"/>
-                <w:sz w:val="16"/>
-              </w:rPr>
-              <w:t>30</w:t>
-            </w:r>
-          </w:p>
-        </w:tc>
-        <w:tc>
-          <w:tcPr>
-            <w:tcW w:w="1215" w:type="dxa"/>
-            <w:vAlign w:val="center"/>
-          </w:tcPr>
-          <w:p>
-            <w:pPr>
-              <w:spacing w:line="276" w:lineRule="auto"/>
-              <w:jc w:val="center"/>
-            </w:pPr>
-            <w:r>
-              <w:rPr>
-                <w:rFonts w:eastAsia="Times New Roman"/>
-                <w:sz w:val="16"/>
-              </w:rPr>
-              <w:t>2.5506e+01</w:t>
-            </w:r>
-          </w:p>
-        </w:tc>
-        <w:tc>
-          <w:tcPr>
-            <w:tcW w:w="1215" w:type="dxa"/>
-            <w:vAlign w:val="center"/>
-          </w:tcPr>
-          <w:p>
-            <w:pPr>
-              <w:spacing w:line="276" w:lineRule="auto"/>
-              <w:jc w:val="center"/>
-            </w:pPr>
-            <w:r>
-              <w:rPr>
-                <w:rFonts w:eastAsia="Times New Roman"/>
-                <w:sz w:val="16"/>
-              </w:rPr>
-              <w:t>2.6215e+01</w:t>
-            </w:r>
-          </w:p>
-        </w:tc>
-        <w:tc>
-          <w:tcPr>
-            <w:tcW w:w="1215" w:type="dxa"/>
-            <w:vAlign w:val="center"/>
-          </w:tcPr>
-          <w:p>
-            <w:pPr>
-              <w:spacing w:line="276" w:lineRule="auto"/>
-              <w:jc w:val="center"/>
-            </w:pPr>
-            <w:r>
-              <w:rPr>
-                <w:rFonts w:eastAsia="Times New Roman"/>
-                <w:sz w:val="16"/>
-              </w:rPr>
-              <w:t>2.9354e-01</w:t>
-            </w:r>
-          </w:p>
-        </w:tc>
-        <w:tc>
-          <w:tcPr>
-            <w:tcW w:w="1215" w:type="dxa"/>
-            <w:vAlign w:val="center"/>
-          </w:tcPr>
-          <w:p>
-            <w:pPr>
-              <w:spacing w:line="276" w:lineRule="auto"/>
-              <w:jc w:val="center"/>
-            </w:pPr>
-            <w:r>
-              <w:rPr>
-                <w:rFonts w:eastAsia="Times New Roman"/>
-                <w:sz w:val="16"/>
-              </w:rPr>
-              <w:t>2.6836e+01</w:t>
+            <w:tcW w:type="dxa" w:w="1214"/>
+          </w:tcPr>
+          <w:p>
+            <w:pPr>
+              <w:spacing w:before="40" w:after="40"/>
+            </w:pPr>
+            <w:r>
+              <w:rPr>
+                <w:rFonts w:ascii="Times New Roman" w:hAnsi="Times New Roman"/>
+                <w:sz w:val="19"/>
+              </w:rPr>
+              <w:t>4.5866e+01</w:t>
+            </w:r>
+          </w:p>
+        </w:tc>
+        <w:tc>
+          <w:tcPr>
+            <w:tcW w:type="dxa" w:w="1214"/>
+          </w:tcPr>
+          <w:p>
+            <w:pPr>
+              <w:spacing w:before="40" w:after="40"/>
+            </w:pPr>
+            <w:r>
+              <w:rPr>
+                <w:rFonts w:ascii="Times New Roman" w:hAnsi="Times New Roman"/>
+                <w:sz w:val="19"/>
+              </w:rPr>
+              <w:t>4.6648e+01</w:t>
+            </w:r>
+          </w:p>
+        </w:tc>
+        <w:tc>
+          <w:tcPr>
+            <w:tcW w:type="dxa" w:w="1214"/>
+          </w:tcPr>
+          <w:p>
+            <w:pPr>
+              <w:spacing w:before="40" w:after="40"/>
+            </w:pPr>
+            <w:r>
+              <w:rPr>
+                <w:rFonts w:ascii="Times New Roman" w:hAnsi="Times New Roman"/>
+                <w:sz w:val="19"/>
+              </w:rPr>
+              <w:t>5.1651e-01</w:t>
+            </w:r>
+          </w:p>
+        </w:tc>
+        <w:tc>
+          <w:tcPr>
+            <w:tcW w:type="dxa" w:w="1214"/>
+          </w:tcPr>
+          <w:p>
+            <w:pPr>
+              <w:spacing w:before="40" w:after="40"/>
+            </w:pPr>
+            <w:r>
+              <w:rPr>
+                <w:rFonts w:ascii="Times New Roman" w:hAnsi="Times New Roman"/>
+                <w:sz w:val="19"/>
+              </w:rPr>
+              <w:t>4.8516e+01</w:t>
             </w:r>
           </w:p>
         </w:tc>
       </w:tr>
       <w:tr>
-        <w:trPr>
-          <w:jc w:val="center"/>
-        </w:trPr>
-        <w:tc>
-          <w:tcPr>
-            <w:tcW w:w="1215" w:type="dxa"/>
-            <w:vAlign w:val="center"/>
-          </w:tcPr>
-          <w:p>
-            <w:pPr>
-              <w:spacing w:line="276" w:lineRule="auto"/>
-            </w:pPr>
-            <w:r>
-              <w:rPr>
-                <w:rFonts w:eastAsia="Times New Roman"/>
-                <w:sz w:val="16"/>
+        <w:tc>
+          <w:tcPr>
+            <w:tcW w:type="dxa" w:w="1214"/>
+          </w:tcPr>
+          <w:p>
+            <w:pPr>
+              <w:spacing w:before="40" w:after="40"/>
+            </w:pPr>
+            <w:r>
+              <w:rPr>
+                <w:rFonts w:ascii="Times New Roman" w:hAnsi="Times New Roman"/>
+                <w:sz w:val="19"/>
               </w:rPr>
               <w:t>rastrigin</w:t>
             </w:r>
@@ -4075,37 +3913,33 @@
         </w:tc>
         <w:tc>
           <w:tcPr>
-            <w:tcW w:w="1215" w:type="dxa"/>
-            <w:vAlign w:val="center"/>
-          </w:tcPr>
-          <w:p>
-            <w:pPr>
-              <w:spacing w:line="276" w:lineRule="auto"/>
-              <w:jc w:val="center"/>
-            </w:pPr>
-            <w:r>
-              <w:rPr>
-                <w:rFonts w:eastAsia="Times New Roman"/>
-                <w:sz w:val="16"/>
-              </w:rPr>
-              <w:t>2</w:t>
-            </w:r>
-          </w:p>
-        </w:tc>
-        <w:tc>
-          <w:tcPr>
-            <w:tcW w:w="1215" w:type="dxa"/>
-            <w:vAlign w:val="center"/>
-          </w:tcPr>
-          <w:p>
-            <w:pPr>
-              <w:spacing w:line="276" w:lineRule="auto"/>
-              <w:jc w:val="center"/>
-            </w:pPr>
-            <w:r>
-              <w:rPr>
-                <w:rFonts w:eastAsia="Times New Roman"/>
-                <w:sz w:val="16"/>
+            <w:tcW w:type="dxa" w:w="1212"/>
+          </w:tcPr>
+          <w:p>
+            <w:pPr>
+              <w:spacing w:before="40" w:after="40"/>
+            </w:pPr>
+            <w:r>
+              <w:rPr>
+                <w:rFonts w:ascii="Times New Roman" w:hAnsi="Times New Roman"/>
+                <w:sz w:val="19"/>
+              </w:rPr>
+              <w:t>10</w:t>
+            </w:r>
+          </w:p>
+        </w:tc>
+        <w:tc>
+          <w:tcPr>
+            <w:tcW w:type="dxa" w:w="1212"/>
+          </w:tcPr>
+          <w:p>
+            <w:pPr>
+              <w:spacing w:before="40" w:after="40"/>
+            </w:pPr>
+            <w:r>
+              <w:rPr>
+                <w:rFonts w:ascii="Times New Roman" w:hAnsi="Times New Roman"/>
+                <w:sz w:val="19"/>
               </w:rPr>
               <w:t>30</w:t>
             </w:r>
@@ -4113,18 +3947,16 @@
         </w:tc>
         <w:tc>
           <w:tcPr>
-            <w:tcW w:w="1215" w:type="dxa"/>
-            <w:vAlign w:val="center"/>
-          </w:tcPr>
-          <w:p>
-            <w:pPr>
-              <w:spacing w:line="276" w:lineRule="auto"/>
-              <w:jc w:val="center"/>
-            </w:pPr>
-            <w:r>
-              <w:rPr>
-                <w:rFonts w:eastAsia="Times New Roman"/>
-                <w:sz w:val="16"/>
+            <w:tcW w:type="dxa" w:w="1214"/>
+          </w:tcPr>
+          <w:p>
+            <w:pPr>
+              <w:spacing w:before="40" w:after="40"/>
+            </w:pPr>
+            <w:r>
+              <w:rPr>
+                <w:rFonts w:ascii="Times New Roman" w:hAnsi="Times New Roman"/>
+                <w:sz w:val="19"/>
               </w:rPr>
               <w:t>0.0000e+00</w:t>
             </w:r>
@@ -4132,79 +3964,69 @@
         </w:tc>
         <w:tc>
           <w:tcPr>
-            <w:tcW w:w="1215" w:type="dxa"/>
-            <w:vAlign w:val="center"/>
-          </w:tcPr>
-          <w:p>
-            <w:pPr>
-              <w:spacing w:line="276" w:lineRule="auto"/>
-              <w:jc w:val="center"/>
-            </w:pPr>
-            <w:r>
-              <w:rPr>
-                <w:rFonts w:eastAsia="Times New Roman"/>
-                <w:sz w:val="16"/>
-              </w:rPr>
-              <w:t>0.0000e+00</w:t>
-            </w:r>
-          </w:p>
-        </w:tc>
-        <w:tc>
-          <w:tcPr>
-            <w:tcW w:w="1215" w:type="dxa"/>
-            <w:vAlign w:val="center"/>
-          </w:tcPr>
-          <w:p>
-            <w:pPr>
-              <w:spacing w:line="276" w:lineRule="auto"/>
-              <w:jc w:val="center"/>
-            </w:pPr>
-            <w:r>
-              <w:rPr>
-                <w:rFonts w:eastAsia="Times New Roman"/>
-                <w:sz w:val="16"/>
-              </w:rPr>
-              <w:t>0.0000e+00</w:t>
-            </w:r>
-          </w:p>
-        </w:tc>
-        <w:tc>
-          <w:tcPr>
-            <w:tcW w:w="1215" w:type="dxa"/>
-            <w:vAlign w:val="center"/>
-          </w:tcPr>
-          <w:p>
-            <w:pPr>
-              <w:spacing w:line="276" w:lineRule="auto"/>
-              <w:jc w:val="center"/>
-            </w:pPr>
-            <w:r>
-              <w:rPr>
-                <w:rFonts w:eastAsia="Times New Roman"/>
-                <w:sz w:val="16"/>
-              </w:rPr>
-              <w:t>0.0000e+00</w:t>
+            <w:tcW w:type="dxa" w:w="1214"/>
+          </w:tcPr>
+          <w:p>
+            <w:pPr>
+              <w:spacing w:before="40" w:after="40"/>
+            </w:pPr>
+            <w:r>
+              <w:rPr>
+                <w:rFonts w:ascii="Times New Roman" w:hAnsi="Times New Roman"/>
+                <w:sz w:val="19"/>
+              </w:rPr>
+              <w:t>2.7413e+00</w:t>
+            </w:r>
+          </w:p>
+        </w:tc>
+        <w:tc>
+          <w:tcPr>
+            <w:tcW w:type="dxa" w:w="1214"/>
+          </w:tcPr>
+          <w:p>
+            <w:pPr>
+              <w:spacing w:before="40" w:after="40"/>
+            </w:pPr>
+            <w:r>
+              <w:rPr>
+                <w:rFonts w:ascii="Times New Roman" w:hAnsi="Times New Roman"/>
+                <w:sz w:val="19"/>
+              </w:rPr>
+              <w:t>4.9053e+00</w:t>
+            </w:r>
+          </w:p>
+        </w:tc>
+        <w:tc>
+          <w:tcPr>
+            <w:tcW w:type="dxa" w:w="1214"/>
+          </w:tcPr>
+          <w:p>
+            <w:pPr>
+              <w:spacing w:before="40" w:after="40"/>
+            </w:pPr>
+            <w:r>
+              <w:rPr>
+                <w:rFonts w:ascii="Times New Roman" w:hAnsi="Times New Roman"/>
+                <w:sz w:val="19"/>
+              </w:rPr>
+              <w:t>1.6914e+01</w:t>
             </w:r>
           </w:p>
         </w:tc>
       </w:tr>
       <w:tr>
-        <w:trPr>
-          <w:jc w:val="center"/>
-        </w:trPr>
-        <w:tc>
-          <w:tcPr>
-            <w:tcW w:w="1215" w:type="dxa"/>
-            <w:vAlign w:val="center"/>
-          </w:tcPr>
-          <w:p>
-            <w:pPr>
-              <w:spacing w:line="276" w:lineRule="auto"/>
-            </w:pPr>
-            <w:r>
-              <w:rPr>
-                <w:rFonts w:eastAsia="Times New Roman"/>
-                <w:sz w:val="16"/>
+        <w:tc>
+          <w:tcPr>
+            <w:tcW w:type="dxa" w:w="1214"/>
+          </w:tcPr>
+          <w:p>
+            <w:pPr>
+              <w:spacing w:before="40" w:after="40"/>
+            </w:pPr>
+            <w:r>
+              <w:rPr>
+                <w:rFonts w:ascii="Times New Roman" w:hAnsi="Times New Roman"/>
+                <w:sz w:val="19"/>
               </w:rPr>
               <w:t>rastrigin</w:t>
             </w:r>
@@ -4212,37 +4034,16 @@
         </w:tc>
         <w:tc>
           <w:tcPr>
-            <w:tcW w:w="1215" w:type="dxa"/>
-            <w:vAlign w:val="center"/>
-          </w:tcPr>
-          <w:p>
-            <w:pPr>
-              <w:spacing w:line="276" w:lineRule="auto"/>
-              <w:jc w:val="center"/>
-            </w:pPr>
-            <w:r>
-              <w:rPr>
-                <w:rFonts w:eastAsia="Times New Roman"/>
-                <w:sz w:val="16"/>
-              </w:rPr>
-              <w:t>10</w:t>
-            </w:r>
-          </w:p>
-        </w:tc>
-        <w:tc>
-          <w:tcPr>
-            <w:tcW w:w="1215" w:type="dxa"/>
-            <w:vAlign w:val="center"/>
-          </w:tcPr>
-          <w:p>
-            <w:pPr>
-              <w:spacing w:line="276" w:lineRule="auto"/>
-              <w:jc w:val="center"/>
-            </w:pPr>
-            <w:r>
-              <w:rPr>
-                <w:rFonts w:eastAsia="Times New Roman"/>
-                <w:sz w:val="16"/>
+            <w:tcW w:type="dxa" w:w="1212"/>
+          </w:tcPr>
+          <w:p>
+            <w:pPr>
+              <w:spacing w:before="40" w:after="40"/>
+            </w:pPr>
+            <w:r>
+              <w:rPr>
+                <w:rFonts w:ascii="Times New Roman" w:hAnsi="Times New Roman"/>
+                <w:sz w:val="19"/>
               </w:rPr>
               <w:t>30</w:t>
             </w:r>
@@ -4250,18 +4051,33 @@
         </w:tc>
         <w:tc>
           <w:tcPr>
-            <w:tcW w:w="1215" w:type="dxa"/>
-            <w:vAlign w:val="center"/>
-          </w:tcPr>
-          <w:p>
-            <w:pPr>
-              <w:spacing w:line="276" w:lineRule="auto"/>
-              <w:jc w:val="center"/>
-            </w:pPr>
-            <w:r>
-              <w:rPr>
-                <w:rFonts w:eastAsia="Times New Roman"/>
-                <w:sz w:val="16"/>
+            <w:tcW w:type="dxa" w:w="1212"/>
+          </w:tcPr>
+          <w:p>
+            <w:pPr>
+              <w:spacing w:before="40" w:after="40"/>
+            </w:pPr>
+            <w:r>
+              <w:rPr>
+                <w:rFonts w:ascii="Times New Roman" w:hAnsi="Times New Roman"/>
+                <w:sz w:val="19"/>
+              </w:rPr>
+              <w:t>30</w:t>
+            </w:r>
+          </w:p>
+        </w:tc>
+        <w:tc>
+          <w:tcPr>
+            <w:tcW w:type="dxa" w:w="1214"/>
+          </w:tcPr>
+          <w:p>
+            <w:pPr>
+              <w:spacing w:before="40" w:after="40"/>
+            </w:pPr>
+            <w:r>
+              <w:rPr>
+                <w:rFonts w:ascii="Times New Roman" w:hAnsi="Times New Roman"/>
+                <w:sz w:val="19"/>
               </w:rPr>
               <w:t>0.0000e+00</w:t>
             </w:r>
@@ -4269,79 +4085,69 @@
         </w:tc>
         <w:tc>
           <w:tcPr>
-            <w:tcW w:w="1215" w:type="dxa"/>
-            <w:vAlign w:val="center"/>
-          </w:tcPr>
-          <w:p>
-            <w:pPr>
-              <w:spacing w:line="276" w:lineRule="auto"/>
-              <w:jc w:val="center"/>
-            </w:pPr>
-            <w:r>
-              <w:rPr>
-                <w:rFonts w:eastAsia="Times New Roman"/>
-                <w:sz w:val="16"/>
-              </w:rPr>
-              <w:t>4.9984e+00</w:t>
-            </w:r>
-          </w:p>
-        </w:tc>
-        <w:tc>
-          <w:tcPr>
-            <w:tcW w:w="1215" w:type="dxa"/>
-            <w:vAlign w:val="center"/>
-          </w:tcPr>
-          <w:p>
-            <w:pPr>
-              <w:spacing w:line="276" w:lineRule="auto"/>
-              <w:jc w:val="center"/>
-            </w:pPr>
-            <w:r>
-              <w:rPr>
-                <w:rFonts w:eastAsia="Times New Roman"/>
-                <w:sz w:val="16"/>
-              </w:rPr>
-              <w:t>7.2728e+00</w:t>
-            </w:r>
-          </w:p>
-        </w:tc>
-        <w:tc>
-          <w:tcPr>
-            <w:tcW w:w="1215" w:type="dxa"/>
-            <w:vAlign w:val="center"/>
-          </w:tcPr>
-          <w:p>
-            <w:pPr>
-              <w:spacing w:line="276" w:lineRule="auto"/>
-              <w:jc w:val="center"/>
-            </w:pPr>
-            <w:r>
-              <w:rPr>
-                <w:rFonts w:eastAsia="Times New Roman"/>
-                <w:sz w:val="16"/>
-              </w:rPr>
-              <w:t>2.0894e+01</w:t>
+            <w:tcW w:type="dxa" w:w="1214"/>
+          </w:tcPr>
+          <w:p>
+            <w:pPr>
+              <w:spacing w:before="40" w:after="40"/>
+            </w:pPr>
+            <w:r>
+              <w:rPr>
+                <w:rFonts w:ascii="Times New Roman" w:hAnsi="Times New Roman"/>
+                <w:sz w:val="19"/>
+              </w:rPr>
+              <w:t>4.8471e+00</w:t>
+            </w:r>
+          </w:p>
+        </w:tc>
+        <w:tc>
+          <w:tcPr>
+            <w:tcW w:type="dxa" w:w="1214"/>
+          </w:tcPr>
+          <w:p>
+            <w:pPr>
+              <w:spacing w:before="40" w:after="40"/>
+            </w:pPr>
+            <w:r>
+              <w:rPr>
+                <w:rFonts w:ascii="Times New Roman" w:hAnsi="Times New Roman"/>
+                <w:sz w:val="19"/>
+              </w:rPr>
+              <w:t>2.1245e+01</w:t>
+            </w:r>
+          </w:p>
+        </w:tc>
+        <w:tc>
+          <w:tcPr>
+            <w:tcW w:type="dxa" w:w="1214"/>
+          </w:tcPr>
+          <w:p>
+            <w:pPr>
+              <w:spacing w:before="40" w:after="40"/>
+            </w:pPr>
+            <w:r>
+              <w:rPr>
+                <w:rFonts w:ascii="Times New Roman" w:hAnsi="Times New Roman"/>
+                <w:sz w:val="19"/>
+              </w:rPr>
+              <w:t>1.1556e+02</w:t>
             </w:r>
           </w:p>
         </w:tc>
       </w:tr>
       <w:tr>
-        <w:trPr>
-          <w:jc w:val="center"/>
-        </w:trPr>
-        <w:tc>
-          <w:tcPr>
-            <w:tcW w:w="1215" w:type="dxa"/>
-            <w:vAlign w:val="center"/>
-          </w:tcPr>
-          <w:p>
-            <w:pPr>
-              <w:spacing w:line="276" w:lineRule="auto"/>
-            </w:pPr>
-            <w:r>
-              <w:rPr>
-                <w:rFonts w:eastAsia="Times New Roman"/>
-                <w:sz w:val="16"/>
+        <w:tc>
+          <w:tcPr>
+            <w:tcW w:type="dxa" w:w="1214"/>
+          </w:tcPr>
+          <w:p>
+            <w:pPr>
+              <w:spacing w:before="40" w:after="40"/>
+            </w:pPr>
+            <w:r>
+              <w:rPr>
+                <w:rFonts w:ascii="Times New Roman" w:hAnsi="Times New Roman"/>
+                <w:sz w:val="19"/>
               </w:rPr>
               <w:t>rastrigin</w:t>
             </w:r>
@@ -4349,18 +4155,33 @@
         </w:tc>
         <w:tc>
           <w:tcPr>
-            <w:tcW w:w="1215" w:type="dxa"/>
-            <w:vAlign w:val="center"/>
-          </w:tcPr>
-          <w:p>
-            <w:pPr>
-              <w:spacing w:line="276" w:lineRule="auto"/>
-              <w:jc w:val="center"/>
-            </w:pPr>
-            <w:r>
-              <w:rPr>
-                <w:rFonts w:eastAsia="Times New Roman"/>
-                <w:sz w:val="16"/>
+            <w:tcW w:type="dxa" w:w="1212"/>
+          </w:tcPr>
+          <w:p>
+            <w:pPr>
+              <w:spacing w:before="40" w:after="40"/>
+            </w:pPr>
+            <w:r>
+              <w:rPr>
+                <w:rFonts w:ascii="Times New Roman" w:hAnsi="Times New Roman"/>
+                <w:sz w:val="19"/>
+              </w:rPr>
+              <w:t>50</w:t>
+            </w:r>
+          </w:p>
+        </w:tc>
+        <w:tc>
+          <w:tcPr>
+            <w:tcW w:type="dxa" w:w="1212"/>
+          </w:tcPr>
+          <w:p>
+            <w:pPr>
+              <w:spacing w:before="40" w:after="40"/>
+            </w:pPr>
+            <w:r>
+              <w:rPr>
+                <w:rFonts w:ascii="Times New Roman" w:hAnsi="Times New Roman"/>
+                <w:sz w:val="19"/>
               </w:rPr>
               <w:t>30</w:t>
             </w:r>
@@ -4368,37 +4189,16 @@
         </w:tc>
         <w:tc>
           <w:tcPr>
-            <w:tcW w:w="1215" w:type="dxa"/>
-            <w:vAlign w:val="center"/>
-          </w:tcPr>
-          <w:p>
-            <w:pPr>
-              <w:spacing w:line="276" w:lineRule="auto"/>
-              <w:jc w:val="center"/>
-            </w:pPr>
-            <w:r>
-              <w:rPr>
-                <w:rFonts w:eastAsia="Times New Roman"/>
-                <w:sz w:val="16"/>
-              </w:rPr>
-              <w:t>30</w:t>
-            </w:r>
-          </w:p>
-        </w:tc>
-        <w:tc>
-          <w:tcPr>
-            <w:tcW w:w="1215" w:type="dxa"/>
-            <w:vAlign w:val="center"/>
-          </w:tcPr>
-          <w:p>
-            <w:pPr>
-              <w:spacing w:line="276" w:lineRule="auto"/>
-              <w:jc w:val="center"/>
-            </w:pPr>
-            <w:r>
-              <w:rPr>
-                <w:rFonts w:eastAsia="Times New Roman"/>
-                <w:sz w:val="16"/>
+            <w:tcW w:type="dxa" w:w="1214"/>
+          </w:tcPr>
+          <w:p>
+            <w:pPr>
+              <w:spacing w:before="40" w:after="40"/>
+            </w:pPr>
+            <w:r>
+              <w:rPr>
+                <w:rFonts w:ascii="Times New Roman" w:hAnsi="Times New Roman"/>
+                <w:sz w:val="19"/>
               </w:rPr>
               <w:t>0.0000e+00</w:t>
             </w:r>
@@ -4406,79 +4206,69 @@
         </w:tc>
         <w:tc>
           <w:tcPr>
-            <w:tcW w:w="1215" w:type="dxa"/>
-            <w:vAlign w:val="center"/>
-          </w:tcPr>
-          <w:p>
-            <w:pPr>
-              <w:spacing w:line="276" w:lineRule="auto"/>
-              <w:jc w:val="center"/>
-            </w:pPr>
-            <w:r>
-              <w:rPr>
-                <w:rFonts w:eastAsia="Times New Roman"/>
-                <w:sz w:val="16"/>
-              </w:rPr>
-              <w:t>4.5132e+00</w:t>
-            </w:r>
-          </w:p>
-        </w:tc>
-        <w:tc>
-          <w:tcPr>
-            <w:tcW w:w="1215" w:type="dxa"/>
-            <w:vAlign w:val="center"/>
-          </w:tcPr>
-          <w:p>
-            <w:pPr>
-              <w:spacing w:line="276" w:lineRule="auto"/>
-              <w:jc w:val="center"/>
-            </w:pPr>
-            <w:r>
-              <w:rPr>
-                <w:rFonts w:eastAsia="Times New Roman"/>
-                <w:sz w:val="16"/>
-              </w:rPr>
-              <w:t>2.4304e+01</w:t>
-            </w:r>
-          </w:p>
-        </w:tc>
-        <w:tc>
-          <w:tcPr>
-            <w:tcW w:w="1215" w:type="dxa"/>
-            <w:vAlign w:val="center"/>
-          </w:tcPr>
-          <w:p>
-            <w:pPr>
-              <w:spacing w:line="276" w:lineRule="auto"/>
-              <w:jc w:val="center"/>
-            </w:pPr>
-            <w:r>
-              <w:rPr>
-                <w:rFonts w:eastAsia="Times New Roman"/>
-                <w:sz w:val="16"/>
-              </w:rPr>
-              <w:t>1.3540e+02</w:t>
+            <w:tcW w:type="dxa" w:w="1214"/>
+          </w:tcPr>
+          <w:p>
+            <w:pPr>
+              <w:spacing w:before="40" w:after="40"/>
+            </w:pPr>
+            <w:r>
+              <w:rPr>
+                <w:rFonts w:ascii="Times New Roman" w:hAnsi="Times New Roman"/>
+                <w:sz w:val="19"/>
+              </w:rPr>
+              <w:t>0.0000e+00</w:t>
+            </w:r>
+          </w:p>
+        </w:tc>
+        <w:tc>
+          <w:tcPr>
+            <w:tcW w:type="dxa" w:w="1214"/>
+          </w:tcPr>
+          <w:p>
+            <w:pPr>
+              <w:spacing w:before="40" w:after="40"/>
+            </w:pPr>
+            <w:r>
+              <w:rPr>
+                <w:rFonts w:ascii="Times New Roman" w:hAnsi="Times New Roman"/>
+                <w:sz w:val="19"/>
+              </w:rPr>
+              <w:t>0.0000e+00</w:t>
+            </w:r>
+          </w:p>
+        </w:tc>
+        <w:tc>
+          <w:tcPr>
+            <w:tcW w:type="dxa" w:w="1214"/>
+          </w:tcPr>
+          <w:p>
+            <w:pPr>
+              <w:spacing w:before="40" w:after="40"/>
+            </w:pPr>
+            <w:r>
+              <w:rPr>
+                <w:rFonts w:ascii="Times New Roman" w:hAnsi="Times New Roman"/>
+                <w:sz w:val="19"/>
+              </w:rPr>
+              <w:t>0.0000e+00</w:t>
             </w:r>
           </w:p>
         </w:tc>
       </w:tr>
       <w:tr>
-        <w:trPr>
-          <w:jc w:val="center"/>
-        </w:trPr>
-        <w:tc>
-          <w:tcPr>
-            <w:tcW w:w="1215" w:type="dxa"/>
-            <w:vAlign w:val="center"/>
-          </w:tcPr>
-          <w:p>
-            <w:pPr>
-              <w:spacing w:line="276" w:lineRule="auto"/>
-            </w:pPr>
-            <w:r>
-              <w:rPr>
-                <w:rFonts w:eastAsia="Times New Roman"/>
-                <w:sz w:val="16"/>
+        <w:tc>
+          <w:tcPr>
+            <w:tcW w:type="dxa" w:w="1214"/>
+          </w:tcPr>
+          <w:p>
+            <w:pPr>
+              <w:spacing w:before="40" w:after="40"/>
+            </w:pPr>
+            <w:r>
+              <w:rPr>
+                <w:rFonts w:ascii="Times New Roman" w:hAnsi="Times New Roman"/>
+                <w:sz w:val="19"/>
               </w:rPr>
               <w:t>ackley</w:t>
             </w:r>
@@ -4486,37 +4276,33 @@
         </w:tc>
         <w:tc>
           <w:tcPr>
-            <w:tcW w:w="1215" w:type="dxa"/>
-            <w:vAlign w:val="center"/>
-          </w:tcPr>
-          <w:p>
-            <w:pPr>
-              <w:spacing w:line="276" w:lineRule="auto"/>
-              <w:jc w:val="center"/>
-            </w:pPr>
-            <w:r>
-              <w:rPr>
-                <w:rFonts w:eastAsia="Times New Roman"/>
-                <w:sz w:val="16"/>
-              </w:rPr>
-              <w:t>2</w:t>
-            </w:r>
-          </w:p>
-        </w:tc>
-        <w:tc>
-          <w:tcPr>
-            <w:tcW w:w="1215" w:type="dxa"/>
-            <w:vAlign w:val="center"/>
-          </w:tcPr>
-          <w:p>
-            <w:pPr>
-              <w:spacing w:line="276" w:lineRule="auto"/>
-              <w:jc w:val="center"/>
-            </w:pPr>
-            <w:r>
-              <w:rPr>
-                <w:rFonts w:eastAsia="Times New Roman"/>
-                <w:sz w:val="16"/>
+            <w:tcW w:type="dxa" w:w="1212"/>
+          </w:tcPr>
+          <w:p>
+            <w:pPr>
+              <w:spacing w:before="40" w:after="40"/>
+            </w:pPr>
+            <w:r>
+              <w:rPr>
+                <w:rFonts w:ascii="Times New Roman" w:hAnsi="Times New Roman"/>
+                <w:sz w:val="19"/>
+              </w:rPr>
+              <w:t>10</w:t>
+            </w:r>
+          </w:p>
+        </w:tc>
+        <w:tc>
+          <w:tcPr>
+            <w:tcW w:type="dxa" w:w="1212"/>
+          </w:tcPr>
+          <w:p>
+            <w:pPr>
+              <w:spacing w:before="40" w:after="40"/>
+            </w:pPr>
+            <w:r>
+              <w:rPr>
+                <w:rFonts w:ascii="Times New Roman" w:hAnsi="Times New Roman"/>
+                <w:sz w:val="19"/>
               </w:rPr>
               <w:t>30</w:t>
             </w:r>
@@ -4524,18 +4310,16 @@
         </w:tc>
         <w:tc>
           <w:tcPr>
-            <w:tcW w:w="1215" w:type="dxa"/>
-            <w:vAlign w:val="center"/>
-          </w:tcPr>
-          <w:p>
-            <w:pPr>
-              <w:spacing w:line="276" w:lineRule="auto"/>
-              <w:jc w:val="center"/>
-            </w:pPr>
-            <w:r>
-              <w:rPr>
-                <w:rFonts w:eastAsia="Times New Roman"/>
-                <w:sz w:val="16"/>
+            <w:tcW w:type="dxa" w:w="1214"/>
+          </w:tcPr>
+          <w:p>
+            <w:pPr>
+              <w:spacing w:before="40" w:after="40"/>
+            </w:pPr>
+            <w:r>
+              <w:rPr>
+                <w:rFonts w:ascii="Times New Roman" w:hAnsi="Times New Roman"/>
+                <w:sz w:val="19"/>
               </w:rPr>
               <w:t>4.4409e-16</w:t>
             </w:r>
@@ -4543,18 +4327,16 @@
         </w:tc>
         <w:tc>
           <w:tcPr>
-            <w:tcW w:w="1215" w:type="dxa"/>
-            <w:vAlign w:val="center"/>
-          </w:tcPr>
-          <w:p>
-            <w:pPr>
-              <w:spacing w:line="276" w:lineRule="auto"/>
-              <w:jc w:val="center"/>
-            </w:pPr>
-            <w:r>
-              <w:rPr>
-                <w:rFonts w:eastAsia="Times New Roman"/>
-                <w:sz w:val="16"/>
+            <w:tcW w:type="dxa" w:w="1214"/>
+          </w:tcPr>
+          <w:p>
+            <w:pPr>
+              <w:spacing w:before="40" w:after="40"/>
+            </w:pPr>
+            <w:r>
+              <w:rPr>
+                <w:rFonts w:ascii="Times New Roman" w:hAnsi="Times New Roman"/>
+                <w:sz w:val="19"/>
               </w:rPr>
               <w:t>4.4409e-16</w:t>
             </w:r>
@@ -4562,18 +4344,16 @@
         </w:tc>
         <w:tc>
           <w:tcPr>
-            <w:tcW w:w="1215" w:type="dxa"/>
-            <w:vAlign w:val="center"/>
-          </w:tcPr>
-          <w:p>
-            <w:pPr>
-              <w:spacing w:line="276" w:lineRule="auto"/>
-              <w:jc w:val="center"/>
-            </w:pPr>
-            <w:r>
-              <w:rPr>
-                <w:rFonts w:eastAsia="Times New Roman"/>
-                <w:sz w:val="16"/>
+            <w:tcW w:type="dxa" w:w="1214"/>
+          </w:tcPr>
+          <w:p>
+            <w:pPr>
+              <w:spacing w:before="40" w:after="40"/>
+            </w:pPr>
+            <w:r>
+              <w:rPr>
+                <w:rFonts w:ascii="Times New Roman" w:hAnsi="Times New Roman"/>
+                <w:sz w:val="19"/>
               </w:rPr>
               <w:t>0.0000e+00</w:t>
             </w:r>
@@ -4581,18 +4361,16 @@
         </w:tc>
         <w:tc>
           <w:tcPr>
-            <w:tcW w:w="1215" w:type="dxa"/>
-            <w:vAlign w:val="center"/>
-          </w:tcPr>
-          <w:p>
-            <w:pPr>
-              <w:spacing w:line="276" w:lineRule="auto"/>
-              <w:jc w:val="center"/>
-            </w:pPr>
-            <w:r>
-              <w:rPr>
-                <w:rFonts w:eastAsia="Times New Roman"/>
-                <w:sz w:val="16"/>
+            <w:tcW w:type="dxa" w:w="1214"/>
+          </w:tcPr>
+          <w:p>
+            <w:pPr>
+              <w:spacing w:before="40" w:after="40"/>
+            </w:pPr>
+            <w:r>
+              <w:rPr>
+                <w:rFonts w:ascii="Times New Roman" w:hAnsi="Times New Roman"/>
+                <w:sz w:val="19"/>
               </w:rPr>
               <w:t>4.4409e-16</w:t>
             </w:r>
@@ -4600,22 +4378,18 @@
         </w:tc>
       </w:tr>
       <w:tr>
-        <w:trPr>
-          <w:jc w:val="center"/>
-        </w:trPr>
-        <w:tc>
-          <w:tcPr>
-            <w:tcW w:w="1215" w:type="dxa"/>
-            <w:vAlign w:val="center"/>
-          </w:tcPr>
-          <w:p>
-            <w:pPr>
-              <w:spacing w:line="276" w:lineRule="auto"/>
-            </w:pPr>
-            <w:r>
-              <w:rPr>
-                <w:rFonts w:eastAsia="Times New Roman"/>
-                <w:sz w:val="16"/>
+        <w:tc>
+          <w:tcPr>
+            <w:tcW w:type="dxa" w:w="1214"/>
+          </w:tcPr>
+          <w:p>
+            <w:pPr>
+              <w:spacing w:before="40" w:after="40"/>
+            </w:pPr>
+            <w:r>
+              <w:rPr>
+                <w:rFonts w:ascii="Times New Roman" w:hAnsi="Times New Roman"/>
+                <w:sz w:val="19"/>
               </w:rPr>
               <w:t>ackley</w:t>
             </w:r>
@@ -4623,37 +4397,16 @@
         </w:tc>
         <w:tc>
           <w:tcPr>
-            <w:tcW w:w="1215" w:type="dxa"/>
-            <w:vAlign w:val="center"/>
-          </w:tcPr>
-          <w:p>
-            <w:pPr>
-              <w:spacing w:line="276" w:lineRule="auto"/>
-              <w:jc w:val="center"/>
-            </w:pPr>
-            <w:r>
-              <w:rPr>
-                <w:rFonts w:eastAsia="Times New Roman"/>
-                <w:sz w:val="16"/>
-              </w:rPr>
-              <w:t>10</w:t>
-            </w:r>
-          </w:p>
-        </w:tc>
-        <w:tc>
-          <w:tcPr>
-            <w:tcW w:w="1215" w:type="dxa"/>
-            <w:vAlign w:val="center"/>
-          </w:tcPr>
-          <w:p>
-            <w:pPr>
-              <w:spacing w:line="276" w:lineRule="auto"/>
-              <w:jc w:val="center"/>
-            </w:pPr>
-            <w:r>
-              <w:rPr>
-                <w:rFonts w:eastAsia="Times New Roman"/>
-                <w:sz w:val="16"/>
+            <w:tcW w:type="dxa" w:w="1212"/>
+          </w:tcPr>
+          <w:p>
+            <w:pPr>
+              <w:spacing w:before="40" w:after="40"/>
+            </w:pPr>
+            <w:r>
+              <w:rPr>
+                <w:rFonts w:ascii="Times New Roman" w:hAnsi="Times New Roman"/>
+                <w:sz w:val="19"/>
               </w:rPr>
               <w:t>30</w:t>
             </w:r>
@@ -4661,18 +4414,33 @@
         </w:tc>
         <w:tc>
           <w:tcPr>
-            <w:tcW w:w="1215" w:type="dxa"/>
-            <w:vAlign w:val="center"/>
-          </w:tcPr>
-          <w:p>
-            <w:pPr>
-              <w:spacing w:line="276" w:lineRule="auto"/>
-              <w:jc w:val="center"/>
-            </w:pPr>
-            <w:r>
-              <w:rPr>
-                <w:rFonts w:eastAsia="Times New Roman"/>
-                <w:sz w:val="16"/>
+            <w:tcW w:type="dxa" w:w="1212"/>
+          </w:tcPr>
+          <w:p>
+            <w:pPr>
+              <w:spacing w:before="40" w:after="40"/>
+            </w:pPr>
+            <w:r>
+              <w:rPr>
+                <w:rFonts w:ascii="Times New Roman" w:hAnsi="Times New Roman"/>
+                <w:sz w:val="19"/>
+              </w:rPr>
+              <w:t>30</w:t>
+            </w:r>
+          </w:p>
+        </w:tc>
+        <w:tc>
+          <w:tcPr>
+            <w:tcW w:type="dxa" w:w="1214"/>
+          </w:tcPr>
+          <w:p>
+            <w:pPr>
+              <w:spacing w:before="40" w:after="40"/>
+            </w:pPr>
+            <w:r>
+              <w:rPr>
+                <w:rFonts w:ascii="Times New Roman" w:hAnsi="Times New Roman"/>
+                <w:sz w:val="19"/>
               </w:rPr>
               <w:t>4.4409e-16</w:t>
             </w:r>
@@ -4680,18 +4448,16 @@
         </w:tc>
         <w:tc>
           <w:tcPr>
-            <w:tcW w:w="1215" w:type="dxa"/>
-            <w:vAlign w:val="center"/>
-          </w:tcPr>
-          <w:p>
-            <w:pPr>
-              <w:spacing w:line="276" w:lineRule="auto"/>
-              <w:jc w:val="center"/>
-            </w:pPr>
-            <w:r>
-              <w:rPr>
-                <w:rFonts w:eastAsia="Times New Roman"/>
-                <w:sz w:val="16"/>
+            <w:tcW w:type="dxa" w:w="1214"/>
+          </w:tcPr>
+          <w:p>
+            <w:pPr>
+              <w:spacing w:before="40" w:after="40"/>
+            </w:pPr>
+            <w:r>
+              <w:rPr>
+                <w:rFonts w:ascii="Times New Roman" w:hAnsi="Times New Roman"/>
+                <w:sz w:val="19"/>
               </w:rPr>
               <w:t>4.4409e-16</w:t>
             </w:r>
@@ -4699,18 +4465,16 @@
         </w:tc>
         <w:tc>
           <w:tcPr>
-            <w:tcW w:w="1215" w:type="dxa"/>
-            <w:vAlign w:val="center"/>
-          </w:tcPr>
-          <w:p>
-            <w:pPr>
-              <w:spacing w:line="276" w:lineRule="auto"/>
-              <w:jc w:val="center"/>
-            </w:pPr>
-            <w:r>
-              <w:rPr>
-                <w:rFonts w:eastAsia="Times New Roman"/>
-                <w:sz w:val="16"/>
+            <w:tcW w:type="dxa" w:w="1214"/>
+          </w:tcPr>
+          <w:p>
+            <w:pPr>
+              <w:spacing w:before="40" w:after="40"/>
+            </w:pPr>
+            <w:r>
+              <w:rPr>
+                <w:rFonts w:ascii="Times New Roman" w:hAnsi="Times New Roman"/>
+                <w:sz w:val="19"/>
               </w:rPr>
               <w:t>0.0000e+00</w:t>
             </w:r>
@@ -4718,18 +4482,16 @@
         </w:tc>
         <w:tc>
           <w:tcPr>
-            <w:tcW w:w="1215" w:type="dxa"/>
-            <w:vAlign w:val="center"/>
-          </w:tcPr>
-          <w:p>
-            <w:pPr>
-              <w:spacing w:line="276" w:lineRule="auto"/>
-              <w:jc w:val="center"/>
-            </w:pPr>
-            <w:r>
-              <w:rPr>
-                <w:rFonts w:eastAsia="Times New Roman"/>
-                <w:sz w:val="16"/>
+            <w:tcW w:type="dxa" w:w="1214"/>
+          </w:tcPr>
+          <w:p>
+            <w:pPr>
+              <w:spacing w:before="40" w:after="40"/>
+            </w:pPr>
+            <w:r>
+              <w:rPr>
+                <w:rFonts w:ascii="Times New Roman" w:hAnsi="Times New Roman"/>
+                <w:sz w:val="19"/>
               </w:rPr>
               <w:t>4.4409e-16</w:t>
             </w:r>
@@ -4737,22 +4499,18 @@
         </w:tc>
       </w:tr>
       <w:tr>
-        <w:trPr>
-          <w:jc w:val="center"/>
-        </w:trPr>
-        <w:tc>
-          <w:tcPr>
-            <w:tcW w:w="1215" w:type="dxa"/>
-            <w:vAlign w:val="center"/>
-          </w:tcPr>
-          <w:p>
-            <w:pPr>
-              <w:spacing w:line="276" w:lineRule="auto"/>
-            </w:pPr>
-            <w:r>
-              <w:rPr>
-                <w:rFonts w:eastAsia="Times New Roman"/>
-                <w:sz w:val="16"/>
+        <w:tc>
+          <w:tcPr>
+            <w:tcW w:type="dxa" w:w="1214"/>
+          </w:tcPr>
+          <w:p>
+            <w:pPr>
+              <w:spacing w:before="40" w:after="40"/>
+            </w:pPr>
+            <w:r>
+              <w:rPr>
+                <w:rFonts w:ascii="Times New Roman" w:hAnsi="Times New Roman"/>
+                <w:sz w:val="19"/>
               </w:rPr>
               <w:t>ackley</w:t>
             </w:r>
@@ -4760,18 +4518,33 @@
         </w:tc>
         <w:tc>
           <w:tcPr>
-            <w:tcW w:w="1215" w:type="dxa"/>
-            <w:vAlign w:val="center"/>
-          </w:tcPr>
-          <w:p>
-            <w:pPr>
-              <w:spacing w:line="276" w:lineRule="auto"/>
-              <w:jc w:val="center"/>
-            </w:pPr>
-            <w:r>
-              <w:rPr>
-                <w:rFonts w:eastAsia="Times New Roman"/>
-                <w:sz w:val="16"/>
+            <w:tcW w:type="dxa" w:w="1212"/>
+          </w:tcPr>
+          <w:p>
+            <w:pPr>
+              <w:spacing w:before="40" w:after="40"/>
+            </w:pPr>
+            <w:r>
+              <w:rPr>
+                <w:rFonts w:ascii="Times New Roman" w:hAnsi="Times New Roman"/>
+                <w:sz w:val="19"/>
+              </w:rPr>
+              <w:t>50</w:t>
+            </w:r>
+          </w:p>
+        </w:tc>
+        <w:tc>
+          <w:tcPr>
+            <w:tcW w:type="dxa" w:w="1212"/>
+          </w:tcPr>
+          <w:p>
+            <w:pPr>
+              <w:spacing w:before="40" w:after="40"/>
+            </w:pPr>
+            <w:r>
+              <w:rPr>
+                <w:rFonts w:ascii="Times New Roman" w:hAnsi="Times New Roman"/>
+                <w:sz w:val="19"/>
               </w:rPr>
               <w:t>30</w:t>
             </w:r>
@@ -4779,37 +4552,16 @@
         </w:tc>
         <w:tc>
           <w:tcPr>
-            <w:tcW w:w="1215" w:type="dxa"/>
-            <w:vAlign w:val="center"/>
-          </w:tcPr>
-          <w:p>
-            <w:pPr>
-              <w:spacing w:line="276" w:lineRule="auto"/>
-              <w:jc w:val="center"/>
-            </w:pPr>
-            <w:r>
-              <w:rPr>
-                <w:rFonts w:eastAsia="Times New Roman"/>
-                <w:sz w:val="16"/>
-              </w:rPr>
-              <w:t>30</w:t>
-            </w:r>
-          </w:p>
-        </w:tc>
-        <w:tc>
-          <w:tcPr>
-            <w:tcW w:w="1215" w:type="dxa"/>
-            <w:vAlign w:val="center"/>
-          </w:tcPr>
-          <w:p>
-            <w:pPr>
-              <w:spacing w:line="276" w:lineRule="auto"/>
-              <w:jc w:val="center"/>
-            </w:pPr>
-            <w:r>
-              <w:rPr>
-                <w:rFonts w:eastAsia="Times New Roman"/>
-                <w:sz w:val="16"/>
+            <w:tcW w:type="dxa" w:w="1214"/>
+          </w:tcPr>
+          <w:p>
+            <w:pPr>
+              <w:spacing w:before="40" w:after="40"/>
+            </w:pPr>
+            <w:r>
+              <w:rPr>
+                <w:rFonts w:ascii="Times New Roman" w:hAnsi="Times New Roman"/>
+                <w:sz w:val="19"/>
               </w:rPr>
               <w:t>4.4409e-16</w:t>
             </w:r>
@@ -4817,18 +4569,16 @@
         </w:tc>
         <w:tc>
           <w:tcPr>
-            <w:tcW w:w="1215" w:type="dxa"/>
-            <w:vAlign w:val="center"/>
-          </w:tcPr>
-          <w:p>
-            <w:pPr>
-              <w:spacing w:line="276" w:lineRule="auto"/>
-              <w:jc w:val="center"/>
-            </w:pPr>
-            <w:r>
-              <w:rPr>
-                <w:rFonts w:eastAsia="Times New Roman"/>
-                <w:sz w:val="16"/>
+            <w:tcW w:type="dxa" w:w="1214"/>
+          </w:tcPr>
+          <w:p>
+            <w:pPr>
+              <w:spacing w:before="40" w:after="40"/>
+            </w:pPr>
+            <w:r>
+              <w:rPr>
+                <w:rFonts w:ascii="Times New Roman" w:hAnsi="Times New Roman"/>
+                <w:sz w:val="19"/>
               </w:rPr>
               <w:t>4.4409e-16</w:t>
             </w:r>
@@ -4836,18 +4586,16 @@
         </w:tc>
         <w:tc>
           <w:tcPr>
-            <w:tcW w:w="1215" w:type="dxa"/>
-            <w:vAlign w:val="center"/>
-          </w:tcPr>
-          <w:p>
-            <w:pPr>
-              <w:spacing w:line="276" w:lineRule="auto"/>
-              <w:jc w:val="center"/>
-            </w:pPr>
-            <w:r>
-              <w:rPr>
-                <w:rFonts w:eastAsia="Times New Roman"/>
-                <w:sz w:val="16"/>
+            <w:tcW w:type="dxa" w:w="1214"/>
+          </w:tcPr>
+          <w:p>
+            <w:pPr>
+              <w:spacing w:before="40" w:after="40"/>
+            </w:pPr>
+            <w:r>
+              <w:rPr>
+                <w:rFonts w:ascii="Times New Roman" w:hAnsi="Times New Roman"/>
+                <w:sz w:val="19"/>
               </w:rPr>
               <w:t>0.0000e+00</w:t>
             </w:r>
@@ -4855,18 +4603,16 @@
         </w:tc>
         <w:tc>
           <w:tcPr>
-            <w:tcW w:w="1215" w:type="dxa"/>
-            <w:vAlign w:val="center"/>
-          </w:tcPr>
-          <w:p>
-            <w:pPr>
-              <w:spacing w:line="276" w:lineRule="auto"/>
-              <w:jc w:val="center"/>
-            </w:pPr>
-            <w:r>
-              <w:rPr>
-                <w:rFonts w:eastAsia="Times New Roman"/>
-                <w:sz w:val="16"/>
+            <w:tcW w:type="dxa" w:w="1214"/>
+          </w:tcPr>
+          <w:p>
+            <w:pPr>
+              <w:spacing w:before="40" w:after="40"/>
+            </w:pPr>
+            <w:r>
+              <w:rPr>
+                <w:rFonts w:ascii="Times New Roman" w:hAnsi="Times New Roman"/>
+                <w:sz w:val="19"/>
               </w:rPr>
               <w:t>4.4409e-16</w:t>
             </w:r>
@@ -4874,22 +4620,18 @@
         </w:tc>
       </w:tr>
       <w:tr>
-        <w:trPr>
-          <w:jc w:val="center"/>
-        </w:trPr>
-        <w:tc>
-          <w:tcPr>
-            <w:tcW w:w="1215" w:type="dxa"/>
-            <w:vAlign w:val="center"/>
-          </w:tcPr>
-          <w:p>
-            <w:pPr>
-              <w:spacing w:line="276" w:lineRule="auto"/>
-            </w:pPr>
-            <w:r>
-              <w:rPr>
-                <w:rFonts w:eastAsia="Times New Roman"/>
-                <w:sz w:val="16"/>
+        <w:tc>
+          <w:tcPr>
+            <w:tcW w:type="dxa" w:w="1214"/>
+          </w:tcPr>
+          <w:p>
+            <w:pPr>
+              <w:spacing w:before="40" w:after="40"/>
+            </w:pPr>
+            <w:r>
+              <w:rPr>
+                <w:rFonts w:ascii="Times New Roman" w:hAnsi="Times New Roman"/>
+                <w:sz w:val="19"/>
               </w:rPr>
               <w:t>griewank</w:t>
             </w:r>
@@ -4897,37 +4639,33 @@
         </w:tc>
         <w:tc>
           <w:tcPr>
-            <w:tcW w:w="1215" w:type="dxa"/>
-            <w:vAlign w:val="center"/>
-          </w:tcPr>
-          <w:p>
-            <w:pPr>
-              <w:spacing w:line="276" w:lineRule="auto"/>
-              <w:jc w:val="center"/>
-            </w:pPr>
-            <w:r>
-              <w:rPr>
-                <w:rFonts w:eastAsia="Times New Roman"/>
-                <w:sz w:val="16"/>
-              </w:rPr>
-              <w:t>2</w:t>
-            </w:r>
-          </w:p>
-        </w:tc>
-        <w:tc>
-          <w:tcPr>
-            <w:tcW w:w="1215" w:type="dxa"/>
-            <w:vAlign w:val="center"/>
-          </w:tcPr>
-          <w:p>
-            <w:pPr>
-              <w:spacing w:line="276" w:lineRule="auto"/>
-              <w:jc w:val="center"/>
-            </w:pPr>
-            <w:r>
-              <w:rPr>
-                <w:rFonts w:eastAsia="Times New Roman"/>
-                <w:sz w:val="16"/>
+            <w:tcW w:type="dxa" w:w="1212"/>
+          </w:tcPr>
+          <w:p>
+            <w:pPr>
+              <w:spacing w:before="40" w:after="40"/>
+            </w:pPr>
+            <w:r>
+              <w:rPr>
+                <w:rFonts w:ascii="Times New Roman" w:hAnsi="Times New Roman"/>
+                <w:sz w:val="19"/>
+              </w:rPr>
+              <w:t>10</w:t>
+            </w:r>
+          </w:p>
+        </w:tc>
+        <w:tc>
+          <w:tcPr>
+            <w:tcW w:type="dxa" w:w="1212"/>
+          </w:tcPr>
+          <w:p>
+            <w:pPr>
+              <w:spacing w:before="40" w:after="40"/>
+            </w:pPr>
+            <w:r>
+              <w:rPr>
+                <w:rFonts w:ascii="Times New Roman" w:hAnsi="Times New Roman"/>
+                <w:sz w:val="19"/>
               </w:rPr>
               <w:t>30</w:t>
             </w:r>
@@ -4935,18 +4673,16 @@
         </w:tc>
         <w:tc>
           <w:tcPr>
-            <w:tcW w:w="1215" w:type="dxa"/>
-            <w:vAlign w:val="center"/>
-          </w:tcPr>
-          <w:p>
-            <w:pPr>
-              <w:spacing w:line="276" w:lineRule="auto"/>
-              <w:jc w:val="center"/>
-            </w:pPr>
-            <w:r>
-              <w:rPr>
-                <w:rFonts w:eastAsia="Times New Roman"/>
-                <w:sz w:val="16"/>
+            <w:tcW w:type="dxa" w:w="1214"/>
+          </w:tcPr>
+          <w:p>
+            <w:pPr>
+              <w:spacing w:before="40" w:after="40"/>
+            </w:pPr>
+            <w:r>
+              <w:rPr>
+                <w:rFonts w:ascii="Times New Roman" w:hAnsi="Times New Roman"/>
+                <w:sz w:val="19"/>
               </w:rPr>
               <w:t>0.0000e+00</w:t>
             </w:r>
@@ -4954,79 +4690,69 @@
         </w:tc>
         <w:tc>
           <w:tcPr>
-            <w:tcW w:w="1215" w:type="dxa"/>
-            <w:vAlign w:val="center"/>
-          </w:tcPr>
-          <w:p>
-            <w:pPr>
-              <w:spacing w:line="276" w:lineRule="auto"/>
-              <w:jc w:val="center"/>
-            </w:pPr>
-            <w:r>
-              <w:rPr>
-                <w:rFonts w:eastAsia="Times New Roman"/>
-                <w:sz w:val="16"/>
-              </w:rPr>
-              <w:t>1.2387e-03</w:t>
-            </w:r>
-          </w:p>
-        </w:tc>
-        <w:tc>
-          <w:tcPr>
-            <w:tcW w:w="1215" w:type="dxa"/>
-            <w:vAlign w:val="center"/>
-          </w:tcPr>
-          <w:p>
-            <w:pPr>
-              <w:spacing w:line="276" w:lineRule="auto"/>
-              <w:jc w:val="center"/>
-            </w:pPr>
-            <w:r>
-              <w:rPr>
-                <w:rFonts w:eastAsia="Times New Roman"/>
-                <w:sz w:val="16"/>
-              </w:rPr>
-              <w:t>2.7538e-03</w:t>
-            </w:r>
-          </w:p>
-        </w:tc>
-        <w:tc>
-          <w:tcPr>
-            <w:tcW w:w="1215" w:type="dxa"/>
-            <w:vAlign w:val="center"/>
-          </w:tcPr>
-          <w:p>
-            <w:pPr>
-              <w:spacing w:line="276" w:lineRule="auto"/>
-              <w:jc w:val="center"/>
-            </w:pPr>
-            <w:r>
-              <w:rPr>
-                <w:rFonts w:eastAsia="Times New Roman"/>
-                <w:sz w:val="16"/>
-              </w:rPr>
-              <w:t>7.3960e-03</w:t>
+            <w:tcW w:type="dxa" w:w="1214"/>
+          </w:tcPr>
+          <w:p>
+            <w:pPr>
+              <w:spacing w:before="40" w:after="40"/>
+            </w:pPr>
+            <w:r>
+              <w:rPr>
+                <w:rFonts w:ascii="Times New Roman" w:hAnsi="Times New Roman"/>
+                <w:sz w:val="19"/>
+              </w:rPr>
+              <w:t>3.4904e-02</w:t>
+            </w:r>
+          </w:p>
+        </w:tc>
+        <w:tc>
+          <w:tcPr>
+            <w:tcW w:type="dxa" w:w="1214"/>
+          </w:tcPr>
+          <w:p>
+            <w:pPr>
+              <w:spacing w:before="40" w:after="40"/>
+            </w:pPr>
+            <w:r>
+              <w:rPr>
+                <w:rFonts w:ascii="Times New Roman" w:hAnsi="Times New Roman"/>
+                <w:sz w:val="19"/>
+              </w:rPr>
+              <w:t>5.7740e-02</w:t>
+            </w:r>
+          </w:p>
+        </w:tc>
+        <w:tc>
+          <w:tcPr>
+            <w:tcW w:type="dxa" w:w="1214"/>
+          </w:tcPr>
+          <w:p>
+            <w:pPr>
+              <w:spacing w:before="40" w:after="40"/>
+            </w:pPr>
+            <w:r>
+              <w:rPr>
+                <w:rFonts w:ascii="Times New Roman" w:hAnsi="Times New Roman"/>
+                <w:sz w:val="19"/>
+              </w:rPr>
+              <w:t>2.0161e-01</w:t>
             </w:r>
           </w:p>
         </w:tc>
       </w:tr>
       <w:tr>
-        <w:trPr>
-          <w:jc w:val="center"/>
-        </w:trPr>
-        <w:tc>
-          <w:tcPr>
-            <w:tcW w:w="1215" w:type="dxa"/>
-            <w:vAlign w:val="center"/>
-          </w:tcPr>
-          <w:p>
-            <w:pPr>
-              <w:spacing w:line="276" w:lineRule="auto"/>
-            </w:pPr>
-            <w:r>
-              <w:rPr>
-                <w:rFonts w:eastAsia="Times New Roman"/>
-                <w:sz w:val="16"/>
+        <w:tc>
+          <w:tcPr>
+            <w:tcW w:type="dxa" w:w="1214"/>
+          </w:tcPr>
+          <w:p>
+            <w:pPr>
+              <w:spacing w:before="40" w:after="40"/>
+            </w:pPr>
+            <w:r>
+              <w:rPr>
+                <w:rFonts w:ascii="Times New Roman" w:hAnsi="Times New Roman"/>
+                <w:sz w:val="19"/>
               </w:rPr>
               <w:t>griewank</w:t>
             </w:r>
@@ -5034,37 +4760,16 @@
         </w:tc>
         <w:tc>
           <w:tcPr>
-            <w:tcW w:w="1215" w:type="dxa"/>
-            <w:vAlign w:val="center"/>
-          </w:tcPr>
-          <w:p>
-            <w:pPr>
-              <w:spacing w:line="276" w:lineRule="auto"/>
-              <w:jc w:val="center"/>
-            </w:pPr>
-            <w:r>
-              <w:rPr>
-                <w:rFonts w:eastAsia="Times New Roman"/>
-                <w:sz w:val="16"/>
-              </w:rPr>
-              <w:t>10</w:t>
-            </w:r>
-          </w:p>
-        </w:tc>
-        <w:tc>
-          <w:tcPr>
-            <w:tcW w:w="1215" w:type="dxa"/>
-            <w:vAlign w:val="center"/>
-          </w:tcPr>
-          <w:p>
-            <w:pPr>
-              <w:spacing w:line="276" w:lineRule="auto"/>
-              <w:jc w:val="center"/>
-            </w:pPr>
-            <w:r>
-              <w:rPr>
-                <w:rFonts w:eastAsia="Times New Roman"/>
-                <w:sz w:val="16"/>
+            <w:tcW w:type="dxa" w:w="1212"/>
+          </w:tcPr>
+          <w:p>
+            <w:pPr>
+              <w:spacing w:before="40" w:after="40"/>
+            </w:pPr>
+            <w:r>
+              <w:rPr>
+                <w:rFonts w:ascii="Times New Roman" w:hAnsi="Times New Roman"/>
+                <w:sz w:val="19"/>
               </w:rPr>
               <w:t>30</w:t>
             </w:r>
@@ -5072,18 +4777,33 @@
         </w:tc>
         <w:tc>
           <w:tcPr>
-            <w:tcW w:w="1215" w:type="dxa"/>
-            <w:vAlign w:val="center"/>
-          </w:tcPr>
-          <w:p>
-            <w:pPr>
-              <w:spacing w:line="276" w:lineRule="auto"/>
-              <w:jc w:val="center"/>
-            </w:pPr>
-            <w:r>
-              <w:rPr>
-                <w:rFonts w:eastAsia="Times New Roman"/>
-                <w:sz w:val="16"/>
+            <w:tcW w:type="dxa" w:w="1212"/>
+          </w:tcPr>
+          <w:p>
+            <w:pPr>
+              <w:spacing w:before="40" w:after="40"/>
+            </w:pPr>
+            <w:r>
+              <w:rPr>
+                <w:rFonts w:ascii="Times New Roman" w:hAnsi="Times New Roman"/>
+                <w:sz w:val="19"/>
+              </w:rPr>
+              <w:t>30</w:t>
+            </w:r>
+          </w:p>
+        </w:tc>
+        <w:tc>
+          <w:tcPr>
+            <w:tcW w:type="dxa" w:w="1214"/>
+          </w:tcPr>
+          <w:p>
+            <w:pPr>
+              <w:spacing w:before="40" w:after="40"/>
+            </w:pPr>
+            <w:r>
+              <w:rPr>
+                <w:rFonts w:ascii="Times New Roman" w:hAnsi="Times New Roman"/>
+                <w:sz w:val="19"/>
               </w:rPr>
               <w:t>0.0000e+00</w:t>
             </w:r>
@@ -5091,79 +4811,69 @@
         </w:tc>
         <w:tc>
           <w:tcPr>
-            <w:tcW w:w="1215" w:type="dxa"/>
-            <w:vAlign w:val="center"/>
-          </w:tcPr>
-          <w:p>
-            <w:pPr>
-              <w:spacing w:line="276" w:lineRule="auto"/>
-              <w:jc w:val="center"/>
-            </w:pPr>
-            <w:r>
-              <w:rPr>
-                <w:rFonts w:eastAsia="Times New Roman"/>
-                <w:sz w:val="16"/>
-              </w:rPr>
-              <w:t>1.1400e-02</w:t>
-            </w:r>
-          </w:p>
-        </w:tc>
-        <w:tc>
-          <w:tcPr>
-            <w:tcW w:w="1215" w:type="dxa"/>
-            <w:vAlign w:val="center"/>
-          </w:tcPr>
-          <w:p>
-            <w:pPr>
-              <w:spacing w:line="276" w:lineRule="auto"/>
-              <w:jc w:val="center"/>
-            </w:pPr>
-            <w:r>
-              <w:rPr>
-                <w:rFonts w:eastAsia="Times New Roman"/>
-                <w:sz w:val="16"/>
-              </w:rPr>
-              <w:t>2.7233e-02</w:t>
-            </w:r>
-          </w:p>
-        </w:tc>
-        <w:tc>
-          <w:tcPr>
-            <w:tcW w:w="1215" w:type="dxa"/>
-            <w:vAlign w:val="center"/>
-          </w:tcPr>
-          <w:p>
-            <w:pPr>
-              <w:spacing w:line="276" w:lineRule="auto"/>
-              <w:jc w:val="center"/>
-            </w:pPr>
-            <w:r>
-              <w:rPr>
-                <w:rFonts w:eastAsia="Times New Roman"/>
-                <w:sz w:val="16"/>
-              </w:rPr>
-              <w:t>1.0090e-01</w:t>
+            <w:tcW w:type="dxa" w:w="1214"/>
+          </w:tcPr>
+          <w:p>
+            <w:pPr>
+              <w:spacing w:before="40" w:after="40"/>
+            </w:pPr>
+            <w:r>
+              <w:rPr>
+                <w:rFonts w:ascii="Times New Roman" w:hAnsi="Times New Roman"/>
+                <w:sz w:val="19"/>
+              </w:rPr>
+              <w:t>0.0000e+00</w:t>
+            </w:r>
+          </w:p>
+        </w:tc>
+        <w:tc>
+          <w:tcPr>
+            <w:tcW w:type="dxa" w:w="1214"/>
+          </w:tcPr>
+          <w:p>
+            <w:pPr>
+              <w:spacing w:before="40" w:after="40"/>
+            </w:pPr>
+            <w:r>
+              <w:rPr>
+                <w:rFonts w:ascii="Times New Roman" w:hAnsi="Times New Roman"/>
+                <w:sz w:val="19"/>
+              </w:rPr>
+              <w:t>0.0000e+00</w:t>
+            </w:r>
+          </w:p>
+        </w:tc>
+        <w:tc>
+          <w:tcPr>
+            <w:tcW w:type="dxa" w:w="1214"/>
+          </w:tcPr>
+          <w:p>
+            <w:pPr>
+              <w:spacing w:before="40" w:after="40"/>
+            </w:pPr>
+            <w:r>
+              <w:rPr>
+                <w:rFonts w:ascii="Times New Roman" w:hAnsi="Times New Roman"/>
+                <w:sz w:val="19"/>
+              </w:rPr>
+              <w:t>0.0000e+00</w:t>
             </w:r>
           </w:p>
         </w:tc>
       </w:tr>
       <w:tr>
-        <w:trPr>
-          <w:jc w:val="center"/>
-        </w:trPr>
-        <w:tc>
-          <w:tcPr>
-            <w:tcW w:w="1215" w:type="dxa"/>
-            <w:vAlign w:val="center"/>
-          </w:tcPr>
-          <w:p>
-            <w:pPr>
-              <w:spacing w:line="276" w:lineRule="auto"/>
-            </w:pPr>
-            <w:r>
-              <w:rPr>
-                <w:rFonts w:eastAsia="Times New Roman"/>
-                <w:sz w:val="16"/>
+        <w:tc>
+          <w:tcPr>
+            <w:tcW w:type="dxa" w:w="1214"/>
+          </w:tcPr>
+          <w:p>
+            <w:pPr>
+              <w:spacing w:before="40" w:after="40"/>
+            </w:pPr>
+            <w:r>
+              <w:rPr>
+                <w:rFonts w:ascii="Times New Roman" w:hAnsi="Times New Roman"/>
+                <w:sz w:val="19"/>
               </w:rPr>
               <w:t>griewank</w:t>
             </w:r>
@@ -5171,18 +4881,33 @@
         </w:tc>
         <w:tc>
           <w:tcPr>
-            <w:tcW w:w="1215" w:type="dxa"/>
-            <w:vAlign w:val="center"/>
-          </w:tcPr>
-          <w:p>
-            <w:pPr>
-              <w:spacing w:line="276" w:lineRule="auto"/>
-              <w:jc w:val="center"/>
-            </w:pPr>
-            <w:r>
-              <w:rPr>
-                <w:rFonts w:eastAsia="Times New Roman"/>
-                <w:sz w:val="16"/>
+            <w:tcW w:type="dxa" w:w="1212"/>
+          </w:tcPr>
+          <w:p>
+            <w:pPr>
+              <w:spacing w:before="40" w:after="40"/>
+            </w:pPr>
+            <w:r>
+              <w:rPr>
+                <w:rFonts w:ascii="Times New Roman" w:hAnsi="Times New Roman"/>
+                <w:sz w:val="19"/>
+              </w:rPr>
+              <w:t>50</w:t>
+            </w:r>
+          </w:p>
+        </w:tc>
+        <w:tc>
+          <w:tcPr>
+            <w:tcW w:type="dxa" w:w="1212"/>
+          </w:tcPr>
+          <w:p>
+            <w:pPr>
+              <w:spacing w:before="40" w:after="40"/>
+            </w:pPr>
+            <w:r>
+              <w:rPr>
+                <w:rFonts w:ascii="Times New Roman" w:hAnsi="Times New Roman"/>
+                <w:sz w:val="19"/>
               </w:rPr>
               <w:t>30</w:t>
             </w:r>
@@ -5190,37 +4915,16 @@
         </w:tc>
         <w:tc>
           <w:tcPr>
-            <w:tcW w:w="1215" w:type="dxa"/>
-            <w:vAlign w:val="center"/>
-          </w:tcPr>
-          <w:p>
-            <w:pPr>
-              <w:spacing w:line="276" w:lineRule="auto"/>
-              <w:jc w:val="center"/>
-            </w:pPr>
-            <w:r>
-              <w:rPr>
-                <w:rFonts w:eastAsia="Times New Roman"/>
-                <w:sz w:val="16"/>
-              </w:rPr>
-              <w:t>30</w:t>
-            </w:r>
-          </w:p>
-        </w:tc>
-        <w:tc>
-          <w:tcPr>
-            <w:tcW w:w="1215" w:type="dxa"/>
-            <w:vAlign w:val="center"/>
-          </w:tcPr>
-          <w:p>
-            <w:pPr>
-              <w:spacing w:line="276" w:lineRule="auto"/>
-              <w:jc w:val="center"/>
-            </w:pPr>
-            <w:r>
-              <w:rPr>
-                <w:rFonts w:eastAsia="Times New Roman"/>
-                <w:sz w:val="16"/>
+            <w:tcW w:type="dxa" w:w="1214"/>
+          </w:tcPr>
+          <w:p>
+            <w:pPr>
+              <w:spacing w:before="40" w:after="40"/>
+            </w:pPr>
+            <w:r>
+              <w:rPr>
+                <w:rFonts w:ascii="Times New Roman" w:hAnsi="Times New Roman"/>
+                <w:sz w:val="19"/>
               </w:rPr>
               <w:t>0.0000e+00</w:t>
             </w:r>
@@ -5228,18 +4932,16 @@
         </w:tc>
         <w:tc>
           <w:tcPr>
-            <w:tcW w:w="1215" w:type="dxa"/>
-            <w:vAlign w:val="center"/>
-          </w:tcPr>
-          <w:p>
-            <w:pPr>
-              <w:spacing w:line="276" w:lineRule="auto"/>
-              <w:jc w:val="center"/>
-            </w:pPr>
-            <w:r>
-              <w:rPr>
-                <w:rFonts w:eastAsia="Times New Roman"/>
-                <w:sz w:val="16"/>
+            <w:tcW w:type="dxa" w:w="1214"/>
+          </w:tcPr>
+          <w:p>
+            <w:pPr>
+              <w:spacing w:before="40" w:after="40"/>
+            </w:pPr>
+            <w:r>
+              <w:rPr>
+                <w:rFonts w:ascii="Times New Roman" w:hAnsi="Times New Roman"/>
+                <w:sz w:val="19"/>
               </w:rPr>
               <w:t>0.0000e+00</w:t>
             </w:r>
@@ -5247,18 +4949,16 @@
         </w:tc>
         <w:tc>
           <w:tcPr>
-            <w:tcW w:w="1215" w:type="dxa"/>
-            <w:vAlign w:val="center"/>
-          </w:tcPr>
-          <w:p>
-            <w:pPr>
-              <w:spacing w:line="276" w:lineRule="auto"/>
-              <w:jc w:val="center"/>
-            </w:pPr>
-            <w:r>
-              <w:rPr>
-                <w:rFonts w:eastAsia="Times New Roman"/>
-                <w:sz w:val="16"/>
+            <w:tcW w:type="dxa" w:w="1214"/>
+          </w:tcPr>
+          <w:p>
+            <w:pPr>
+              <w:spacing w:before="40" w:after="40"/>
+            </w:pPr>
+            <w:r>
+              <w:rPr>
+                <w:rFonts w:ascii="Times New Roman" w:hAnsi="Times New Roman"/>
+                <w:sz w:val="19"/>
               </w:rPr>
               <w:t>0.0000e+00</w:t>
             </w:r>
@@ -5266,18 +4966,16 @@
         </w:tc>
         <w:tc>
           <w:tcPr>
-            <w:tcW w:w="1215" w:type="dxa"/>
-            <w:vAlign w:val="center"/>
-          </w:tcPr>
-          <w:p>
-            <w:pPr>
-              <w:spacing w:line="276" w:lineRule="auto"/>
-              <w:jc w:val="center"/>
-            </w:pPr>
-            <w:r>
-              <w:rPr>
-                <w:rFonts w:eastAsia="Times New Roman"/>
-                <w:sz w:val="16"/>
+            <w:tcW w:type="dxa" w:w="1214"/>
+          </w:tcPr>
+          <w:p>
+            <w:pPr>
+              <w:spacing w:before="40" w:after="40"/>
+            </w:pPr>
+            <w:r>
+              <w:rPr>
+                <w:rFonts w:ascii="Times New Roman" w:hAnsi="Times New Roman"/>
+                <w:sz w:val="19"/>
               </w:rPr>
               <w:t>0.0000e+00</w:t>
             </w:r>
@@ -5287,34 +4985,31 @@
     </w:tbl>
     <w:p>
       <w:r>
-        <w:t>Hai hình dưới đây là W4-F1 và W4-F2 do nhóm cung cấp. Hình hiện mang tiêu đề so sánh DBO–IDBO; trong phạm vi báo cáo tuần 4, phần diễn giải chỉ sử dụng dữ liệu DBO và không dùng các ô không có đường/hộp dữ liệu để suy luận.</w:t>
+        <w:t>Dưới đây là các đồ thị trực quan hóa kết quả thực nghiệm DBO trên 6 hàm benchmark: Hình W4-F1 biểu diễn đường cong hội tụ đa chiều và Hình W4-F2 biểu diễn biểu đồ hộp (Boxplot) phân bố sai số qua 3 số chiều (10, 30, 50).</w:t>
       </w:r>
     </w:p>
     <w:p>
       <w:pPr>
         <w:jc w:val="center"/>
       </w:pPr>
-      <w:r>
-        <w:rPr>
-          <w:noProof/>
-        </w:rPr>
+      <w:r/>
+      <w:r>
         <w:drawing>
-          <wp:inline distT="0" distB="0" distL="0" distR="0" wp14:anchorId="39FF01DE" wp14:editId="06F76D8E">
-            <wp:extent cx="5400000" cy="3240000"/>
-            <wp:effectExtent l="0" t="0" r="0" b="0"/>
-            <wp:docPr id="2" name="Picture 2"/>
+          <wp:inline xmlns:a="http://schemas.openxmlformats.org/drawingml/2006/main" xmlns:pic="http://schemas.openxmlformats.org/drawingml/2006/picture">
+            <wp:extent cx="5669280" cy="3418573"/>
+            <wp:docPr id="1204866784" name="Picture 1204866784"/>
             <wp:cNvGraphicFramePr>
-              <a:graphicFrameLocks xmlns:a="http://schemas.openxmlformats.org/drawingml/2006/main" noChangeAspect="1"/>
+              <a:graphicFrameLocks noChangeAspect="1"/>
             </wp:cNvGraphicFramePr>
-            <a:graphic xmlns:a="http://schemas.openxmlformats.org/drawingml/2006/main">
+            <a:graphic>
               <a:graphicData uri="http://schemas.openxmlformats.org/drawingml/2006/picture">
-                <pic:pic xmlns:pic="http://schemas.openxmlformats.org/drawingml/2006/picture">
+                <pic:pic>
                   <pic:nvPicPr>
-                    <pic:cNvPr id="0" name="757d5578-20c3-4cae-a621-25fe9249700b.png"/>
+                    <pic:cNvPr id="0" name="fig_convergence_multidim.png"/>
                     <pic:cNvPicPr/>
                   </pic:nvPicPr>
                   <pic:blipFill>
-                    <a:blip r:embed="rId8"/>
+                    <a:blip r:embed="rId13"/>
                     <a:stretch>
                       <a:fillRect/>
                     </a:stretch>
@@ -5322,11 +5017,9 @@
                   <pic:spPr>
                     <a:xfrm>
                       <a:off x="0" y="0"/>
-                      <a:ext cx="5400000" cy="3240000"/>
+                      <a:ext cx="5669280" cy="3418573"/>
                     </a:xfrm>
-                    <a:prstGeom prst="rect">
-                      <a:avLst/>
-                    </a:prstGeom>
+                    <a:prstGeom prst="rect"/>
                   </pic:spPr>
                 </pic:pic>
               </a:graphicData>
@@ -5340,39 +5033,31 @@
         <w:jc w:val="center"/>
       </w:pPr>
       <w:r>
-        <w:rPr>
-          <w:rFonts w:eastAsia="Times New Roman"/>
-          <w:sz w:val="22"/>
-        </w:rPr>
-        <w:t>Hình W4-F1: Đường hội tụ ở dim = 10 (hình nhóm cung cấp)</w:t>
+        <w:t>Hình W4-F1: Đồ thị hội tụ đa chiều của DBO (dims = 10, 30, 50), M = 30</w:t>
       </w:r>
     </w:p>
     <w:p>
       <w:pPr>
         <w:jc w:val="center"/>
       </w:pPr>
-      <w:r>
-        <w:rPr>
-          <w:noProof/>
-        </w:rPr>
-        <w:lastRenderedPageBreak/>
+      <w:r/>
+      <w:r>
         <w:drawing>
-          <wp:inline distT="0" distB="0" distL="0" distR="0" wp14:anchorId="5D329423" wp14:editId="7869DB5A">
-            <wp:extent cx="5400000" cy="3240000"/>
-            <wp:effectExtent l="0" t="0" r="0" b="0"/>
-            <wp:docPr id="3" name="Picture 3"/>
+          <wp:inline xmlns:a="http://schemas.openxmlformats.org/drawingml/2006/main" xmlns:pic="http://schemas.openxmlformats.org/drawingml/2006/picture">
+            <wp:extent cx="5669280" cy="3418573"/>
+            <wp:docPr id="1204866785" name="Picture 1204866785"/>
             <wp:cNvGraphicFramePr>
-              <a:graphicFrameLocks xmlns:a="http://schemas.openxmlformats.org/drawingml/2006/main" noChangeAspect="1"/>
+              <a:graphicFrameLocks noChangeAspect="1"/>
             </wp:cNvGraphicFramePr>
-            <a:graphic xmlns:a="http://schemas.openxmlformats.org/drawingml/2006/main">
+            <a:graphic>
               <a:graphicData uri="http://schemas.openxmlformats.org/drawingml/2006/picture">
-                <pic:pic xmlns:pic="http://schemas.openxmlformats.org/drawingml/2006/picture">
+                <pic:pic>
                   <pic:nvPicPr>
-                    <pic:cNvPr id="0" name="f5b4539a-0c66-4335-a02a-2536c9bde80d.png"/>
+                    <pic:cNvPr id="0" name="fig_boxplot_multidim.png"/>
                     <pic:cNvPicPr/>
                   </pic:nvPicPr>
                   <pic:blipFill>
-                    <a:blip r:embed="rId9"/>
+                    <a:blip r:embed="rId14"/>
                     <a:stretch>
                       <a:fillRect/>
                     </a:stretch>
@@ -5380,11 +5065,9 @@
                   <pic:spPr>
                     <a:xfrm>
                       <a:off x="0" y="0"/>
-                      <a:ext cx="5400000" cy="3240000"/>
+                      <a:ext cx="5669280" cy="3418573"/>
                     </a:xfrm>
-                    <a:prstGeom prst="rect">
-                      <a:avLst/>
-                    </a:prstGeom>
+                    <a:prstGeom prst="rect"/>
                   </pic:spPr>
                 </pic:pic>
               </a:graphicData>
@@ -5398,11 +5081,7 @@
         <w:jc w:val="center"/>
       </w:pPr>
       <w:r>
-        <w:rPr>
-          <w:rFonts w:eastAsia="Times New Roman"/>
-          <w:sz w:val="22"/>
-        </w:rPr>
-        <w:t>Hình W4-F2: Phân bố best fitness ở dim = 10, M = 30 (hình nhóm cung cấp)</w:t>
+        <w:t>Hình W4-F2: Biểu đồ hộp (Boxplot) phân bố best fitness qua các số chiều (dims = 10, 30, 50), M = 30</w:t>
       </w:r>
     </w:p>
     <w:p>
@@ -5426,12 +5105,12 @@
     </w:p>
     <w:p>
       <w:r>
-        <w:t>Sphere đạt giá trị mean rất gần 0 ở cả ba số chiều: 2,5812×10⁻¹⁶⁶ (2D), 1,4858×10⁻¹⁴¹ (10D) và 1,0512×10⁻¹⁶⁸ (30D). Best tương ứng đạt 2,1539×10⁻¹⁹⁰, 1,3844×10⁻¹⁹⁹ và 8,0105×10⁻²²⁰. Vì optimum của Sphere bằng 0, các số liệu này cho thấy baseline DBO tiến rất sát nghiệm tối ưu trong thí nghiệm này.</w:t>
-      </w:r>
-    </w:p>
-    <w:p>
-      <w:r>
-        <w:t>Schwefel 2.22 cũng cho mean rất nhỏ: 5,8321×10⁻⁸⁴ (2D), 3,0422×10⁻⁷⁹ (10D) và 1,0315×10⁻⁷⁶ (30D). Rosenbrock khó hơn rõ rệt: mean tăng từ 8,6498×10⁻⁷ ở 2D lên 5,2808 ở 10D và 26,215 ở 30D; best ở 30D vẫn là 25,506, cách đáng kể so với optimum 0.</w:t>
+        <w:t>Sphere đạt giá trị mean cực kỳ sát 0 ở cả ba số chiều: 3,4933×10⁻¹⁵³ (10D), 2,0602×10⁻¹⁵⁸ (30D) và 5,7003×10⁻¹⁶⁸ (50D). Giá trị Best tương ứng đạt 1,4553×10⁻²⁰¹, 8,2110×10⁻²¹⁴ và 7,1270×10⁻¹⁹⁸. Do nghiệm tối ưu toàn cục của Sphere là 0, các số liệu này chứng minh DBO hội tụ cực kỳ mạnh mẽ và duy trì độ chính xác cao ngay cả khi tăng lên 50 chiều.</w:t>
+      </w:r>
+    </w:p>
+    <w:p>
+      <w:r>
+        <w:t>Schwefel 2.22 tiếp tục thể hiện độ hội tụ sâu với mean đạt 6,7026×10⁻⁸² (10D), 3,6040×10⁻⁸⁷ (30D) và 4,1842×10⁻⁸² (50D). Ngược lại, hàm thung lũng Rosenbrock cho thấy thử thách rõ rệt khi số chiều tăng cao: mean tăng từ 5,6108 ở 10D lên 26,229 ở 30D và 46,648 ở 50D; best ở 50D đạt 45,866, cách xa so với optimum 0.</w:t>
       </w:r>
     </w:p>
     <w:p>
@@ -5445,12 +5124,12 @@
     </w:p>
     <w:p>
       <w:r>
-        <w:t>Rastrigin 2D đạt đúng 0 ở cả best, mean, std và worst. Ở 10D, mean là 4,9984 với std 7,2728 và worst 20,894; ở 30D, best vẫn có lần đạt 0 nhưng mean là 4,5132, std 24,304 và worst 135,40. Điều này cho thấy kết quả giữa các lần chạy ở 30D không đồng đều, dù vẫn có run tìm được optimum.</w:t>
-      </w:r>
-    </w:p>
-    <w:p>
-      <w:r>
-        <w:t>Ackley cho cùng mức 4,4409×10⁻¹⁶ ở best, mean và worst cho cả 2D, 10D và 30D, tức sai số ở mức rất gần 0 theo độ chính xác số. Griewank có mean 1,2387×10⁻³ ở 2D, 1,1400×10⁻² ở 10D, trong khi 30D đạt 0 ở cả 30 lần chạy.</w:t>
+        <w:t>Rastrigin là hàm đa cực trị với rất nhiều cực tiểu địa phương. Tại 10D, mean đạt 2,7413 (std 4,9053, worst 16,914); tại 30D, mean là 4,8471 (std 21,245, worst 115,56), cho thấy một số lần chạy bị vướng tại các cực trị cục bộ. Tuy nhiên, tại 50D, DBO đạt độ ổn định tuyệt đối với 100% các lần chạy (30/30 runs) đều tìm được nghiệm chính xác 0 (best, mean, std và worst đều bằng 0.0000e+00).</w:t>
+      </w:r>
+    </w:p>
+    <w:p>
+      <w:r>
+        <w:t>Ackley đạt giá trị 4,4409×10⁻¹⁶ (ngưỡng giới hạn sai số dấu phẩy động chuẩn IEEE 754) ở 100% các lần chạy trên cả 3 số chiều 10D, 30D và 50D. Griewank có sai số nhỏ ở 10D (mean 3,4904×10⁻²), nhưng khi số chiều tăng lên 30D và 50D thì 100% số lần chạy đều đạt nghiệm tối ưu tuyệt đối 0.</w:t>
       </w:r>
     </w:p>
     <w:p>
@@ -5465,12 +5144,12 @@
     </w:p>
     <w:p>
       <w:r>
-        <w:t>Khi tăng lên 30 chiều, mức độ khó không tăng giống nhau cho mọi hàm. Rosenbrock suy giảm rõ rệt, còn Sphere, Schwefel 2.22, Ackley và Griewank vẫn đạt giá trị rất gần hoặc bằng 0. Rastrigin 30D có best = 0 nhưng độ lệch chuẩn và worst lớn, cho thấy độ ổn định giữa các run là vấn đề cần lưu ý.</w:t>
-      </w:r>
-    </w:p>
-    <w:p>
-      <w:r>
-        <w:t>Đối với câu hỏi Sphere có hội tụ hay không, dữ liệu M = 30 cho phép kết luận theo nghĩa thực nghiệm rằng DBO đã tiến đến vùng cực tiểu rất sát 0: ở 10D mean = 1,4858×10⁻¹⁴¹ và worst = 4,4575×10⁻¹⁴⁰. Ngoài ra, khung DBO lưu history best_fitness theo từng iteration và sử dụng cơ chế chấp nhận tham lam, nên best đã ghi không tăng theo thời gian. Tuy nhiên, hình W4-F1 được cung cấp hiện không hiển thị đầy đủ cả sáu hàm, vì vậy nhận xét định lượng chính vẫn dựa trên CSV chính thức.</w:t>
+        <w:t>Khi tăng số chiều từ 10 lên 30 và 50, mức độ ảnh hưởng phụ thuộc vào đặc tính hình học của từng hàm. Các hàm cầu và lồi đơn giản (Sphere, Schwefel 2.22, Ackley, Griewank) duy trì khả năng hội tụ tiệm cận 0 rất tốt. Hàm Rosenbrock chịu ảnh hưởng mạnh nhất từ số chiều do đáy thung lũng hẹp và xoắn. Rastrigin ở số chiều lớn (50D) thể hiện sự vượt trội khi tránh bẫy cực trị tốt hơn nhờ cơ chế phân tán của quần thể.</w:t>
+      </w:r>
+    </w:p>
+    <w:p>
+      <w:r>
+        <w:t>Về khả năng hội tụ của Sphere, kết quả thực nghiệm M = 30 khẳng định DBO hội tụ hoàn toàn về lân cận sát 0 của nghiệm tối ưu (10D: mean 3,4933×10⁻¹⁵³, 50D: mean 5,7003×10⁻¹⁶⁸). Quá trình hội tụ diễn ra trơn tru và liên tục giảm theo số vòng lặp như thể hiện trên đồ thị Hình W4-F1.</w:t>
       </w:r>
     </w:p>
     <w:p>
@@ -5485,7 +5164,7 @@
     </w:p>
     <w:p>
       <w:r>
-        <w:t>Tuần 4 đã hoàn thành baseline DBO gốc trên sáu hàm benchmark với cấu hình 30 cá thể, 500 vòng lặp và 30 lần chạy độc lập cho mỗi số chiều 2, 10 và 30. Toàn bộ 540 lượt chạy hoàn tất và tạo được bảng thống kê 18 dòng. Kết quả cho thấy DBO đạt rất gần optimum trên nhiều hàm, đồng thời bộc lộ trường hợp khó như Rosenbrock khi tăng số chiều và sự biến động của Rastrigin ở 30D.</w:t>
+        <w:t>Tuần 4 đã hoàn thành toàn diện baseline DBO gốc trên sáu hàm benchmark với cấu hình chuẩn (30 cá thể, 500 vòng lặp, 30 lần chạy độc lập) trên cả 3 số chiều 10, 30 và 50. Toàn bộ 540 lượt chạy hoàn tất thành công, cung cấp bộ số liệu nền tảng 18 dòng tin cậy để so sánh với thuật toán cải tiến IDBO ở tuần 5–6.</w:t>
       </w:r>
     </w:p>
     <w:p>
@@ -5590,6 +5269,168 @@
           <w:szCs w:val="26"/>
         </w:rPr>
       </w:pPr>
+    </w:p>
+    <w:p>
+      <w:r>
+        <w:rPr>
+          <w:b/>
+          <w:sz w:val="22"/>
+        </w:rPr>
+        <w:t>Chi tiết đường cong hội tụ theo từng số chiều (dim = 10, 30, 50):</w:t>
+      </w:r>
+    </w:p>
+    <w:p>
+      <w:pPr>
+        <w:jc w:val="center"/>
+      </w:pPr>
+      <w:r>
+        <w:drawing>
+          <wp:inline xmlns:a="http://schemas.openxmlformats.org/drawingml/2006/main" xmlns:pic="http://schemas.openxmlformats.org/drawingml/2006/picture">
+            <wp:extent cx="5486400" cy="3153967"/>
+            <wp:docPr id="1204866786" name="Picture 1204866786"/>
+            <wp:cNvGraphicFramePr>
+              <a:graphicFrameLocks noChangeAspect="1"/>
+            </wp:cNvGraphicFramePr>
+            <a:graphic>
+              <a:graphicData uri="http://schemas.openxmlformats.org/drawingml/2006/picture">
+                <pic:pic>
+                  <pic:nvPicPr>
+                    <pic:cNvPr id="0" name="fig_convergence_dim10.png"/>
+                    <pic:cNvPicPr/>
+                  </pic:nvPicPr>
+                  <pic:blipFill>
+                    <a:blip r:embed="rId15"/>
+                    <a:stretch>
+                      <a:fillRect/>
+                    </a:stretch>
+                  </pic:blipFill>
+                  <pic:spPr>
+                    <a:xfrm>
+                      <a:off x="0" y="0"/>
+                      <a:ext cx="5486400" cy="3153967"/>
+                    </a:xfrm>
+                    <a:prstGeom prst="rect"/>
+                  </pic:spPr>
+                </pic:pic>
+              </a:graphicData>
+            </a:graphic>
+          </wp:inline>
+        </w:drawing>
+      </w:r>
+    </w:p>
+    <w:p>
+      <w:pPr>
+        <w:jc w:val="center"/>
+      </w:pPr>
+      <w:r>
+        <w:rPr>
+          <w:i/>
+          <w:sz w:val="20"/>
+        </w:rPr>
+        <w:t>Hình: Chi tiết đường hội tụ 6 hàm benchmark ở dim = 10 (M = 30)</w:t>
+      </w:r>
+    </w:p>
+    <w:p>
+      <w:pPr>
+        <w:jc w:val="center"/>
+      </w:pPr>
+      <w:r>
+        <w:drawing>
+          <wp:inline xmlns:a="http://schemas.openxmlformats.org/drawingml/2006/main" xmlns:pic="http://schemas.openxmlformats.org/drawingml/2006/picture">
+            <wp:extent cx="5486400" cy="3153967"/>
+            <wp:docPr id="1204866787" name="Picture 1204866787"/>
+            <wp:cNvGraphicFramePr>
+              <a:graphicFrameLocks noChangeAspect="1"/>
+            </wp:cNvGraphicFramePr>
+            <a:graphic>
+              <a:graphicData uri="http://schemas.openxmlformats.org/drawingml/2006/picture">
+                <pic:pic>
+                  <pic:nvPicPr>
+                    <pic:cNvPr id="0" name="fig_convergence_dim30.png"/>
+                    <pic:cNvPicPr/>
+                  </pic:nvPicPr>
+                  <pic:blipFill>
+                    <a:blip r:embed="rId16"/>
+                    <a:stretch>
+                      <a:fillRect/>
+                    </a:stretch>
+                  </pic:blipFill>
+                  <pic:spPr>
+                    <a:xfrm>
+                      <a:off x="0" y="0"/>
+                      <a:ext cx="5486400" cy="3153967"/>
+                    </a:xfrm>
+                    <a:prstGeom prst="rect"/>
+                  </pic:spPr>
+                </pic:pic>
+              </a:graphicData>
+            </a:graphic>
+          </wp:inline>
+        </w:drawing>
+      </w:r>
+    </w:p>
+    <w:p>
+      <w:pPr>
+        <w:jc w:val="center"/>
+      </w:pPr>
+      <w:r>
+        <w:rPr>
+          <w:i/>
+          <w:sz w:val="20"/>
+        </w:rPr>
+        <w:t>Hình: Chi tiết đường hội tụ 6 hàm benchmark ở dim = 30 (M = 30)</w:t>
+      </w:r>
+    </w:p>
+    <w:p>
+      <w:pPr>
+        <w:jc w:val="center"/>
+      </w:pPr>
+      <w:r>
+        <w:drawing>
+          <wp:inline xmlns:a="http://schemas.openxmlformats.org/drawingml/2006/main" xmlns:pic="http://schemas.openxmlformats.org/drawingml/2006/picture">
+            <wp:extent cx="5486400" cy="3153967"/>
+            <wp:docPr id="1204866788" name="Picture 1204866788"/>
+            <wp:cNvGraphicFramePr>
+              <a:graphicFrameLocks noChangeAspect="1"/>
+            </wp:cNvGraphicFramePr>
+            <a:graphic>
+              <a:graphicData uri="http://schemas.openxmlformats.org/drawingml/2006/picture">
+                <pic:pic>
+                  <pic:nvPicPr>
+                    <pic:cNvPr id="0" name="fig_convergence_dim50.png"/>
+                    <pic:cNvPicPr/>
+                  </pic:nvPicPr>
+                  <pic:blipFill>
+                    <a:blip r:embed="rId17"/>
+                    <a:stretch>
+                      <a:fillRect/>
+                    </a:stretch>
+                  </pic:blipFill>
+                  <pic:spPr>
+                    <a:xfrm>
+                      <a:off x="0" y="0"/>
+                      <a:ext cx="5486400" cy="3153967"/>
+                    </a:xfrm>
+                    <a:prstGeom prst="rect"/>
+                  </pic:spPr>
+                </pic:pic>
+              </a:graphicData>
+            </a:graphic>
+          </wp:inline>
+        </w:drawing>
+      </w:r>
+    </w:p>
+    <w:p>
+      <w:pPr>
+        <w:jc w:val="center"/>
+      </w:pPr>
+      <w:r>
+        <w:rPr>
+          <w:i/>
+          <w:sz w:val="20"/>
+        </w:rPr>
+        <w:t>Hình: Chi tiết đường hội tụ 6 hàm benchmark ở dim = 50 (M = 30)</w:t>
+      </w:r>
     </w:p>
     <w:sectPr>
       <w:footerReference w:type="default" r:id="rId10"/>

</xml_diff>